<commit_message>
rebrand portfolio for AI engineering roles
</commit_message>
<xml_diff>
--- a/public/Joshua_Nwachinemere_CV.docx
+++ b/public/Joshua_Nwachinemere_CV.docx
@@ -25,7 +25,7 @@
           <w:b/>
           <w:sz w:val="21"/>
         </w:rPr>
-        <w:t>AI Engineer | Applied AI, ML Systems, Automation</w:t>
+        <w:t>AI Engineer | Python, RAG, Multimodal AI &amp; ML Evaluation</w:t>
       </w:r>
     </w:p>
     <w:p>
@@ -33,9 +33,6 @@
         <w:spacing w:after="0"/>
         <w:jc w:val="center"/>
       </w:pPr>
-      <w:r>
-        <w:t xml:space="preserve">Lagos, Nigeria | Open to UK relocation | </w:t>
-      </w:r>
       <w:hyperlink r:id="rId10">
         <w:r>
           <w:rPr>
@@ -105,7 +102,7 @@
         <w:spacing w:after="40"/>
       </w:pPr>
       <w:r>
-        <w:t>AI Engineer and VolyxAI founder building applied AI, backend services, and automation systems with Python, JavaScript, and TypeScript. Experience includes a multimodal macOS assistant, retrieval workflows, real-time applications, ML evaluation, API integrations, and human-in-the-loop automation.</w:t>
+        <w:t>Python-first AI Engineer building systems around language, vision, and speech models. Work spans RAG and relevance-ranked retrieval, multimodal inputs, real-time transcription, model/API integration, FastAPI services, asynchronous workflows, and ML evaluation. Building VolyxAI with explicit data flow, validation, observability, and human control. Open to AI Engineer and ML Engineer opportunities.</w:t>
       </w:r>
     </w:p>
     <w:p>
@@ -126,7 +123,7 @@
         <w:ind w:left="288" w:hanging="173"/>
       </w:pPr>
       <w:r>
-        <w:t>- Languages: Python, JavaScript, TypeScript, SQL</w:t>
+        <w:t>- Languages: Python, SQL</w:t>
       </w:r>
     </w:p>
     <w:p>
@@ -135,7 +132,7 @@
         <w:ind w:left="288" w:hanging="173"/>
       </w:pPr>
       <w:r>
-        <w:t>- AI / ML: Azure AI Foundry, XGBoost, scikit-learn, pandas, Ollama, LangChain, Chroma, RAG, model evaluation</w:t>
+        <w:t>- AI Engineering: RAG, context engineering, multimodal inference, voice AI, structured outputs, provider routing, model evaluation</w:t>
       </w:r>
     </w:p>
     <w:p>
@@ -144,7 +141,7 @@
         <w:ind w:left="288" w:hanging="173"/>
       </w:pPr>
       <w:r>
-        <w:t>- Backend &amp; Automation: FastAPI, Express, Socket.IO, n8n, REST APIs, webhooks, SQLAlchemy, SQLite</w:t>
+        <w:t>- Models &amp; Providers: Azure AI Foundry, OpenAI, Anthropic, Gemini, DeepSeek, Deepgram</w:t>
       </w:r>
     </w:p>
     <w:p>
@@ -153,7 +150,25 @@
         <w:ind w:left="288" w:hanging="173"/>
       </w:pPr>
       <w:r>
-        <w:t>- Infrastructure: Docker, GitHub Actions, Linux, Microsoft Azure, Electron</w:t>
+        <w:t>- ML &amp; Data: scikit-learn, XGBoost, pandas, feature engineering, temporal evaluation</w:t>
+      </w:r>
+    </w:p>
+    <w:p>
+      <w:pPr>
+        <w:spacing w:after="0"/>
+        <w:ind w:left="288" w:hanging="173"/>
+      </w:pPr>
+      <w:r>
+        <w:t>- Backend &amp; Automation: FastAPI, asyncio, REST APIs, n8n, webhooks, SQLAlchemy</w:t>
+      </w:r>
+    </w:p>
+    <w:p>
+      <w:pPr>
+        <w:spacing w:after="0"/>
+        <w:ind w:left="288" w:hanging="173"/>
+      </w:pPr>
+      <w:r>
+        <w:t>- Data &amp; Infrastructure: PostgreSQL, SQLite, Redis, Docker, GitHub Actions, Linux</w:t>
       </w:r>
     </w:p>
     <w:p>
@@ -185,7 +200,7 @@
         <w:rPr>
           <w:b/>
         </w:rPr>
-        <w:t>Founder &amp; AI Automation Engineer</w:t>
+        <w:t>AI Engineer (Building VolyxAI)</w:t>
       </w:r>
       <w:r>
         <w:rPr>
@@ -208,7 +223,7 @@
         <w:ind w:left="288" w:hanging="173"/>
       </w:pPr>
       <w:r>
-        <w:t>- Built and tested controlled workflow prototypes connecting conversational intake to schema validation, calendar scheduling, email confirmation, and approval-based handoffs.</w:t>
+        <w:t>- Developing applied AI systems that combine model and provider integration, RAG and context assembly, voice and multimodal workflows, and structured outputs.</w:t>
       </w:r>
     </w:p>
     <w:p>
@@ -217,7 +232,7 @@
         <w:ind w:left="288" w:hanging="173"/>
       </w:pPr>
       <w:r>
-        <w:t>- Integrated language models, n8n, webhooks, Vapi, ElevenLabs, Google Calendar, and email services in controlled test environments.</w:t>
+        <w:t>- Building Python services and event-driven n8n workflows around external APIs, webhooks, validation, retries, logging, and human approval.</w:t>
       </w:r>
     </w:p>
     <w:p>
@@ -226,7 +241,7 @@
         <w:ind w:left="288" w:hanging="173"/>
       </w:pPr>
       <w:r>
-        <w:t>- Designed deterministic validation, bounded retries, idempotency controls, and human approval for consequential actions.</w:t>
+        <w:t>- Exploring provider routing, fallback, cost, latency, and privacy trade-offs across Azure AI Foundry, OpenAI-compatible APIs, and transcription providers.</w:t>
       </w:r>
     </w:p>
     <w:p>
@@ -240,7 +255,7 @@
         <w:t xml:space="preserve">Key tools: </w:t>
       </w:r>
       <w:r>
-        <w:t>Python, n8n, TypeScript, REST APIs, webhooks, Vapi, ElevenLabs, Azure AI Foundry</w:t>
+        <w:t>Python, FastAPI, n8n, REST APIs, webhooks, Azure AI Foundry, OpenAI-compatible APIs, PostgreSQL, Redis</w:t>
       </w:r>
     </w:p>
     <w:p>
@@ -251,7 +266,7 @@
         <w:rPr>
           <w:b/>
         </w:rPr>
-        <w:t>Independent Software &amp; Automation Developer</w:t>
+        <w:t>Independent AI, Backend &amp; Automation Developer</w:t>
       </w:r>
       <w:r>
         <w:rPr>
@@ -283,7 +298,7 @@
         <w:ind w:left="288" w:hanging="173"/>
       </w:pPr>
       <w:r>
-        <w:t>- Developed stream-oriented utilities for processing large text datasets without loading complete files into memory.</w:t>
+        <w:t>- Created asynchronous VirusTotal scanning and multi-chain wallet analytics with validation, caching, pagination, and rate-limit handling.</w:t>
       </w:r>
     </w:p>
     <w:p>
@@ -292,7 +307,7 @@
         <w:ind w:left="288" w:hanging="173"/>
       </w:pPr>
       <w:r>
-        <w:t>- Created asynchronous integrations for wallet analysis, malware scanning, user tracking, pagination, caching, and admin reporting.</w:t>
+        <w:t>- Developed and evaluated an experimental football forecasting pipeline with temporal features, calibrated models, FastAPI, and rolling-origin testing.</w:t>
       </w:r>
     </w:p>
     <w:p>
@@ -401,7 +416,7 @@
         <w:ind w:left="288" w:hanging="173"/>
       </w:pPr>
       <w:r>
-        <w:t>- Developed and substantially extended a macOS assistant that combines explicitly selected screen context, microphone input, and meeting audio with user-configured AI providers.</w:t>
+        <w:t>- Built and hardened a privacy-oriented macOS assistant combining selected screen context, microphone input, meeting audio, local OCR, relevance-ranked retrieval, and multiple AI providers.</w:t>
       </w:r>
     </w:p>
     <w:p>
@@ -410,7 +425,7 @@
         <w:ind w:left="288" w:hanging="173"/>
       </w:pPr>
       <w:r>
-        <w:t>- Implemented local OCR, bounded screenshot memory, context ranking, provider routing, and consent before larger image uploads.</w:t>
+        <w:t>- Implemented bounded context memory, transcription and provider routing, explicit data-sharing controls, and cost-aware fallbacks.</w:t>
       </w:r>
     </w:p>
     <w:p>
@@ -487,7 +502,7 @@
         <w:ind w:left="288" w:hanging="173"/>
       </w:pPr>
       <w:r>
-        <w:t xml:space="preserve">- Archived evidence: </w:t>
+        <w:t xml:space="preserve">- Source: </w:t>
       </w:r>
       <w:hyperlink r:id="rId15">
         <w:r>
@@ -495,7 +510,7 @@
             <w:color w:val="1155CC"/>
             <w:u w:val="single"/>
           </w:rPr>
-          <w:t>https://github.com/dk3yyyy/football_predictor/tree/repair/football-predictor-hardening</w:t>
+          <w:t>https://github.com/dk3yyyy/football_predictor</w:t>
         </w:r>
       </w:hyperlink>
       <w:r/>
@@ -617,6 +632,56 @@
             <w:u w:val="single"/>
           </w:rPr>
           <w:t>https://github.com/dk3yyyy/VirusTotal-Telegram-Bot</w:t>
+        </w:r>
+      </w:hyperlink>
+      <w:r/>
+    </w:p>
+    <w:p>
+      <w:pPr>
+        <w:spacing w:after="0"/>
+      </w:pPr>
+      <w:r>
+        <w:rPr>
+          <w:b/>
+        </w:rPr>
+        <w:t>Solana &amp; Ethereum Wallet Analyzer | Async API Aggregation</w:t>
+      </w:r>
+    </w:p>
+    <w:p>
+      <w:pPr>
+        <w:spacing w:after="0"/>
+      </w:pPr>
+      <w:r>
+        <w:rPr>
+          <w:i/>
+        </w:rPr>
+        <w:t>Python, aiohttp, Telegram Bot API, Solana RPC, Ethereum RPC, CoinGecko</w:t>
+      </w:r>
+    </w:p>
+    <w:p>
+      <w:pPr>
+        <w:spacing w:after="0"/>
+        <w:ind w:left="288" w:hanging="173"/>
+      </w:pPr>
+      <w:r>
+        <w:t>- Built a read-only Telegram bot that validates wallet addresses, aggregates holdings and price data across Solana and Ethereum APIs, caches requests, and paginates token results.</w:t>
+      </w:r>
+    </w:p>
+    <w:p>
+      <w:pPr>
+        <w:spacing w:after="0"/>
+        <w:ind w:left="288" w:hanging="173"/>
+      </w:pPr>
+      <w:r>
+        <w:t xml:space="preserve">- Source: </w:t>
+      </w:r>
+      <w:hyperlink r:id="rId19">
+        <w:r>
+          <w:rPr>
+            <w:color w:val="1155CC"/>
+            <w:u w:val="single"/>
+          </w:rPr>
+          <w:t>https://github.com/dk3yyyy/sol-eth-wallet-analyzer</w:t>
         </w:r>
       </w:hyperlink>
       <w:r/>

</xml_diff>

<commit_message>
docs(cv): add merged open-source contributions
</commit_message>
<xml_diff>
--- a/public/Joshua_Nwachinemere_CV.docx
+++ b/public/Joshua_Nwachinemere_CV.docx
@@ -385,6 +385,136 @@
           <w:b/>
           <w:sz w:val="23"/>
         </w:rPr>
+        <w:t>OPEN-SOURCE CONTRIBUTIONS</w:t>
+      </w:r>
+    </w:p>
+    <w:p>
+      <w:pPr>
+        <w:spacing w:after="0"/>
+      </w:pPr>
+      <w:r>
+        <w:rPr>
+          <w:b/>
+        </w:rPr>
+        <w:t>OpenAI Agents Python SDK | Merged PR #3991</w:t>
+      </w:r>
+    </w:p>
+    <w:p>
+      <w:pPr>
+        <w:spacing w:after="0"/>
+      </w:pPr>
+      <w:r>
+        <w:rPr>
+          <w:i/>
+        </w:rPr>
+        <w:t>Python, WebSockets, retry policies, pytest | Jul 2026</w:t>
+      </w:r>
+    </w:p>
+    <w:p>
+      <w:pPr>
+        <w:spacing w:after="0"/>
+        <w:ind w:left="288" w:hanging="173"/>
+      </w:pPr>
+      <w:r>
+        <w:t>- Fixed pre-response WebSocket server-error frames bypassing the SDK retry policy while preserving overload and replay-safety boundaries.</w:t>
+      </w:r>
+    </w:p>
+    <w:p>
+      <w:pPr>
+        <w:spacing w:after="0"/>
+        <w:ind w:left="288" w:hanging="173"/>
+      </w:pPr>
+      <w:r>
+        <w:t>- Added regression coverage for retryable server errors and non-retryable overloaded responses.</w:t>
+      </w:r>
+    </w:p>
+    <w:p>
+      <w:pPr>
+        <w:spacing w:after="0"/>
+        <w:ind w:left="288" w:hanging="173"/>
+      </w:pPr>
+      <w:r>
+        <w:t xml:space="preserve">- PR: </w:t>
+      </w:r>
+      <w:hyperlink r:id="rId14">
+        <w:r>
+          <w:rPr>
+            <w:color w:val="1155CC"/>
+            <w:u w:val="single"/>
+          </w:rPr>
+          <w:t>https://github.com/openai/openai-agents-python/pull/3991</w:t>
+        </w:r>
+      </w:hyperlink>
+      <w:r/>
+    </w:p>
+    <w:p>
+      <w:pPr>
+        <w:spacing w:after="0"/>
+      </w:pPr>
+      <w:r>
+        <w:rPr>
+          <w:b/>
+        </w:rPr>
+        <w:t>Calkit | Merged PR #1028</w:t>
+      </w:r>
+    </w:p>
+    <w:p>
+      <w:pPr>
+        <w:spacing w:after="0"/>
+      </w:pPr>
+      <w:r>
+        <w:rPr>
+          <w:i/>
+        </w:rPr>
+        <w:t>Python, CLI workflow execution, pytest | Jul 2026</w:t>
+      </w:r>
+    </w:p>
+    <w:p>
+      <w:pPr>
+        <w:spacing w:after="0"/>
+        <w:ind w:left="288" w:hanging="173"/>
+      </w:pPr>
+      <w:r>
+        <w:t>- Fixed single-item workflow runs preparing unrelated subprojects and narrowed environment checks to the requested stage.</w:t>
+      </w:r>
+    </w:p>
+    <w:p>
+      <w:pPr>
+        <w:spacing w:after="0"/>
+        <w:ind w:left="288" w:hanging="173"/>
+      </w:pPr>
+      <w:r>
+        <w:t>- Added regression coverage for root-project and subproject execution paths.</w:t>
+      </w:r>
+    </w:p>
+    <w:p>
+      <w:pPr>
+        <w:spacing w:after="0"/>
+        <w:ind w:left="288" w:hanging="173"/>
+      </w:pPr>
+      <w:r>
+        <w:t xml:space="preserve">- PR: </w:t>
+      </w:r>
+      <w:hyperlink r:id="rId15">
+        <w:r>
+          <w:rPr>
+            <w:color w:val="1155CC"/>
+            <w:u w:val="single"/>
+          </w:rPr>
+          <w:t>https://github.com/calkit/calkit/pull/1028</w:t>
+        </w:r>
+      </w:hyperlink>
+      <w:r/>
+    </w:p>
+    <w:p>
+      <w:pPr>
+        <w:spacing w:before="120" w:after="40"/>
+      </w:pPr>
+      <w:r>
+        <w:rPr>
+          <w:b/>
+          <w:sz w:val="23"/>
+        </w:rPr>
         <w:t>SELECTED PROJECTS</w:t>
       </w:r>
     </w:p>
@@ -445,7 +575,7 @@
       <w:r>
         <w:t xml:space="preserve">- Source: </w:t>
       </w:r>
-      <w:hyperlink r:id="rId14">
+      <w:hyperlink r:id="rId16">
         <w:r>
           <w:rPr>
             <w:color w:val="1155CC"/>
@@ -504,7 +634,7 @@
       <w:r>
         <w:t xml:space="preserve">- Source: </w:t>
       </w:r>
-      <w:hyperlink r:id="rId15">
+      <w:hyperlink r:id="rId17">
         <w:r>
           <w:rPr>
             <w:color w:val="1155CC"/>
@@ -563,7 +693,7 @@
       <w:r>
         <w:t xml:space="preserve">- Live: </w:t>
       </w:r>
-      <w:hyperlink r:id="rId16">
+      <w:hyperlink r:id="rId18">
         <w:r>
           <w:rPr>
             <w:color w:val="1155CC"/>
@@ -575,113 +705,13 @@
       <w:r>
         <w:t xml:space="preserve"> | Source: </w:t>
       </w:r>
-      <w:hyperlink r:id="rId17">
+      <w:hyperlink r:id="rId19">
         <w:r>
           <w:rPr>
             <w:color w:val="1155CC"/>
             <w:u w:val="single"/>
           </w:rPr>
           <w:t>https://github.com/dk3yyyy/Noughtline</w:t>
-        </w:r>
-      </w:hyperlink>
-      <w:r/>
-    </w:p>
-    <w:p>
-      <w:pPr>
-        <w:spacing w:after="0"/>
-      </w:pPr>
-      <w:r>
-        <w:rPr>
-          <w:b/>
-        </w:rPr>
-        <w:t>VirusTotal Telegram Bot | Security API Integration</w:t>
-      </w:r>
-    </w:p>
-    <w:p>
-      <w:pPr>
-        <w:spacing w:after="0"/>
-      </w:pPr>
-      <w:r>
-        <w:rPr>
-          <w:i/>
-        </w:rPr>
-        <w:t>Python, Pyrogram, aiohttp, VirusTotal API</w:t>
-      </w:r>
-    </w:p>
-    <w:p>
-      <w:pPr>
-        <w:spacing w:after="0"/>
-        <w:ind w:left="288" w:hanging="173"/>
-      </w:pPr>
-      <w:r>
-        <w:t>- Built asynchronous file, URL, and hash scanning with local SHA-256 lookup, VirusTotal large-file upload handling, bounded retry backoff, and short-lived report caching.</w:t>
-      </w:r>
-    </w:p>
-    <w:p>
-      <w:pPr>
-        <w:spacing w:after="0"/>
-        <w:ind w:left="288" w:hanging="173"/>
-      </w:pPr>
-      <w:r>
-        <w:t xml:space="preserve">- Source: </w:t>
-      </w:r>
-      <w:hyperlink r:id="rId18">
-        <w:r>
-          <w:rPr>
-            <w:color w:val="1155CC"/>
-            <w:u w:val="single"/>
-          </w:rPr>
-          <w:t>https://github.com/dk3yyyy/VirusTotal-Telegram-Bot</w:t>
-        </w:r>
-      </w:hyperlink>
-      <w:r/>
-    </w:p>
-    <w:p>
-      <w:pPr>
-        <w:spacing w:after="0"/>
-      </w:pPr>
-      <w:r>
-        <w:rPr>
-          <w:b/>
-        </w:rPr>
-        <w:t>Solana &amp; Ethereum Wallet Analyzer | Async API Aggregation</w:t>
-      </w:r>
-    </w:p>
-    <w:p>
-      <w:pPr>
-        <w:spacing w:after="0"/>
-      </w:pPr>
-      <w:r>
-        <w:rPr>
-          <w:i/>
-        </w:rPr>
-        <w:t>Python, aiohttp, Telegram Bot API, Solana RPC, Ethereum RPC, CoinGecko</w:t>
-      </w:r>
-    </w:p>
-    <w:p>
-      <w:pPr>
-        <w:spacing w:after="0"/>
-        <w:ind w:left="288" w:hanging="173"/>
-      </w:pPr>
-      <w:r>
-        <w:t>- Built a read-only Telegram bot that validates wallet addresses, aggregates holdings and price data across Solana and Ethereum APIs, caches requests, and paginates token results.</w:t>
-      </w:r>
-    </w:p>
-    <w:p>
-      <w:pPr>
-        <w:spacing w:after="0"/>
-        <w:ind w:left="288" w:hanging="173"/>
-      </w:pPr>
-      <w:r>
-        <w:t xml:space="preserve">- Source: </w:t>
-      </w:r>
-      <w:hyperlink r:id="rId19">
-        <w:r>
-          <w:rPr>
-            <w:color w:val="1155CC"/>
-            <w:u w:val="single"/>
-          </w:rPr>
-          <w:t>https://github.com/dk3yyyy/sol-eth-wallet-analyzer</w:t>
         </w:r>
       </w:hyperlink>
       <w:r/>

</xml_diff>

<commit_message>
docs(cv): add merged FastStream contribution
</commit_message>
<xml_diff>
--- a/public/Joshua_Nwachinemere_CV.docx
+++ b/public/Joshua_Nwachinemere_CV.docx
@@ -396,6 +396,56 @@
         <w:rPr>
           <w:b/>
         </w:rPr>
+        <w:t>FastStream | Merged PR #2961</w:t>
+      </w:r>
+    </w:p>
+    <w:p>
+      <w:pPr>
+        <w:spacing w:after="0"/>
+      </w:pPr>
+      <w:r>
+        <w:rPr>
+          <w:i/>
+        </w:rPr>
+        <w:t>Python, FastAPI compatibility, dependency injection, AsyncAPI, pytest | Jul 2026</w:t>
+      </w:r>
+    </w:p>
+    <w:p>
+      <w:pPr>
+        <w:spacing w:after="0"/>
+        <w:ind w:left="288" w:hanging="173"/>
+      </w:pPr>
+      <w:r>
+        <w:t>- Restored FastAPI 0.140 compatibility by adapting FastStream's dependency layer to FastAPI's slotted Dependant model, preserving AsyncAPI metadata and adding nested-dependency regression coverage.</w:t>
+      </w:r>
+    </w:p>
+    <w:p>
+      <w:pPr>
+        <w:spacing w:after="0"/>
+        <w:ind w:left="288" w:hanging="173"/>
+      </w:pPr>
+      <w:r>
+        <w:t xml:space="preserve">- PR: </w:t>
+      </w:r>
+      <w:hyperlink r:id="rId14">
+        <w:r>
+          <w:rPr>
+            <w:color w:val="1155CC"/>
+            <w:u w:val="single"/>
+          </w:rPr>
+          <w:t>https://github.com/ag2ai/faststream/pull/2961</w:t>
+        </w:r>
+      </w:hyperlink>
+      <w:r/>
+    </w:p>
+    <w:p>
+      <w:pPr>
+        <w:spacing w:after="0"/>
+      </w:pPr>
+      <w:r>
+        <w:rPr>
+          <w:b/>
+        </w:rPr>
         <w:t>OpenAI Agents Python SDK | Merged PR #3991</w:t>
       </w:r>
     </w:p>
@@ -416,16 +466,7 @@
         <w:ind w:left="288" w:hanging="173"/>
       </w:pPr>
       <w:r>
-        <w:t>- Fixed pre-response WebSocket server-error frames bypassing the SDK retry policy while preserving overload and replay-safety boundaries.</w:t>
-      </w:r>
-    </w:p>
-    <w:p>
-      <w:pPr>
-        <w:spacing w:after="0"/>
-        <w:ind w:left="288" w:hanging="173"/>
-      </w:pPr>
-      <w:r>
-        <w:t>- Added regression coverage for retryable server errors and non-retryable overloaded responses.</w:t>
+        <w:t>- Fixed pre-response WebSocket server-error frames bypassing the SDK retry policy, preserving overload and replay-safety boundaries with focused regression coverage.</w:t>
       </w:r>
     </w:p>
     <w:p>
@@ -436,7 +477,7 @@
       <w:r>
         <w:t xml:space="preserve">- PR: </w:t>
       </w:r>
-      <w:hyperlink r:id="rId14">
+      <w:hyperlink r:id="rId15">
         <w:r>
           <w:rPr>
             <w:color w:val="1155CC"/>
@@ -475,16 +516,7 @@
         <w:ind w:left="288" w:hanging="173"/>
       </w:pPr>
       <w:r>
-        <w:t>- Fixed single-item workflow runs preparing unrelated subprojects and narrowed environment checks to the requested stage.</w:t>
-      </w:r>
-    </w:p>
-    <w:p>
-      <w:pPr>
-        <w:spacing w:after="0"/>
-        <w:ind w:left="288" w:hanging="173"/>
-      </w:pPr>
-      <w:r>
-        <w:t>- Added regression coverage for root-project and subproject execution paths.</w:t>
+        <w:t>- Fixed single-item workflow runs preparing unrelated subprojects, narrowing checks to the requested stage with root-project and subproject regression coverage.</w:t>
       </w:r>
     </w:p>
     <w:p>
@@ -495,7 +527,7 @@
       <w:r>
         <w:t xml:space="preserve">- PR: </w:t>
       </w:r>
-      <w:hyperlink r:id="rId15">
+      <w:hyperlink r:id="rId16">
         <w:r>
           <w:rPr>
             <w:color w:val="1155CC"/>
@@ -575,7 +607,7 @@
       <w:r>
         <w:t xml:space="preserve">- Source: </w:t>
       </w:r>
-      <w:hyperlink r:id="rId16">
+      <w:hyperlink r:id="rId17">
         <w:r>
           <w:rPr>
             <w:color w:val="1155CC"/>
@@ -634,7 +666,7 @@
       <w:r>
         <w:t xml:space="preserve">- Source: </w:t>
       </w:r>
-      <w:hyperlink r:id="rId17">
+      <w:hyperlink r:id="rId18">
         <w:r>
           <w:rPr>
             <w:color w:val="1155CC"/>
@@ -693,7 +725,7 @@
       <w:r>
         <w:t xml:space="preserve">- Live: </w:t>
       </w:r>
-      <w:hyperlink r:id="rId18">
+      <w:hyperlink r:id="rId19">
         <w:r>
           <w:rPr>
             <w:color w:val="1155CC"/>
@@ -705,7 +737,7 @@
       <w:r>
         <w:t xml:space="preserve"> | Source: </w:t>
       </w:r>
-      <w:hyperlink r:id="rId19">
+      <w:hyperlink r:id="rId20">
         <w:r>
           <w:rPr>
             <w:color w:val="1155CC"/>

</xml_diff>

<commit_message>
feat: sharpen recruiter evidence and portfolio navigation
</commit_message>
<xml_diff>
--- a/public/Joshua_Nwachinemere_CV.docx
+++ b/public/Joshua_Nwachinemere_CV.docx
@@ -189,7 +189,7 @@
           <w:b/>
           <w:sz w:val="23"/>
         </w:rPr>
-        <w:t>PROFESSIONAL EXPERIENCE</w:t>
+        <w:t>INDEPENDENT PRODUCT &amp; ENGINEERING WORK</w:t>
       </w:r>
     </w:p>
     <w:p>
@@ -200,7 +200,7 @@
         <w:rPr>
           <w:b/>
         </w:rPr>
-        <w:t>AI Engineer (Building VolyxAI)</w:t>
+        <w:t>AI Engineer · VolyxAI product work</w:t>
       </w:r>
       <w:r>
         <w:rPr>
@@ -214,7 +214,7 @@
         <w:spacing w:after="0"/>
       </w:pPr>
       <w:r>
-        <w:t>VolyxAI</w:t>
+        <w:t>Independent product effort</w:t>
       </w:r>
     </w:p>
     <w:p>
@@ -266,7 +266,7 @@
         <w:rPr>
           <w:b/>
         </w:rPr>
-        <w:t>Independent AI, Backend &amp; Automation Developer</w:t>
+        <w:t>AI, Backend &amp; Automation Projects</w:t>
       </w:r>
       <w:r>
         <w:rPr>
@@ -280,7 +280,7 @@
         <w:spacing w:after="0"/>
       </w:pPr>
       <w:r>
-        <w:t>Self-Employed / Independent Projects</w:t>
+        <w:t>Independent engineering work</w:t>
       </w:r>
     </w:p>
     <w:p>

</xml_diff>

<commit_message>
feat: strengthen portfolio evidence and accessibility
</commit_message>
<xml_diff>
--- a/public/Joshua_Nwachinemere_CV.docx
+++ b/public/Joshua_Nwachinemere_CV.docx
@@ -25,7 +25,7 @@
           <w:b/>
           <w:sz w:val="21"/>
         </w:rPr>
-        <w:t>AI Engineer | Python, RAG, Multimodal AI &amp; ML Evaluation</w:t>
+        <w:t>AI Engineer | Python, Retrieval, Context Engineering, Multimodal AI &amp; ML Evaluation</w:t>
       </w:r>
     </w:p>
     <w:p>
@@ -87,6 +87,7 @@
     </w:p>
     <w:p>
       <w:pPr>
+        <w:pStyle w:val="Heading1"/>
         <w:spacing w:before="120" w:after="40"/>
       </w:pPr>
       <w:r>
@@ -102,11 +103,12 @@
         <w:spacing w:after="40"/>
       </w:pPr>
       <w:r>
-        <w:t>AI Engineer building Python systems around language, vision, and speech models. Work spans RAG and relevance-ranked retrieval, multimodal inputs, real-time transcription, model/API integration, FastAPI services, asynchronous workflows, and ML evaluation. Building VolyxAI with explicit data flow, validation, observability, and human control. Open to AI Engineer and ML Engineer opportunities.</w:t>
+        <w:t>AI Engineer building Python systems around language, vision, and speech models. Work spans retrieval and context assembly, multimodal inputs, real-time transcription, model/API integration, FastAPI services, asynchronous workflows, and ML evaluation. Building VolyxAI with explicit data flow, validation, observability, and human control. Open to AI Engineer and ML Engineer opportunities.</w:t>
       </w:r>
     </w:p>
     <w:p>
       <w:pPr>
+        <w:pStyle w:val="Heading1"/>
         <w:spacing w:before="120" w:after="40"/>
       </w:pPr>
       <w:r>
@@ -121,67 +123,96 @@
       <w:pPr>
         <w:spacing w:after="0"/>
         <w:ind w:left="288" w:hanging="173"/>
+        <w:numPr>
+          <w:ilvl w:val="0"/>
+          <w:numId w:val="10"/>
+        </w:numPr>
       </w:pPr>
       <w:r>
-        <w:t>- Languages: Python, SQL</w:t>
+        <w:t>Languages: Python, SQL</w:t>
       </w:r>
     </w:p>
     <w:p>
       <w:pPr>
         <w:spacing w:after="0"/>
         <w:ind w:left="288" w:hanging="173"/>
+        <w:numPr>
+          <w:ilvl w:val="0"/>
+          <w:numId w:val="10"/>
+        </w:numPr>
       </w:pPr>
       <w:r>
-        <w:t>- AI Engineering: RAG, context engineering, multimodal inference, voice AI, structured outputs, provider routing, model evaluation</w:t>
+        <w:t>AI Engineering: retrieval, context engineering, multimodal inference, voice AI, structured outputs, provider routing, model evaluation</w:t>
       </w:r>
     </w:p>
     <w:p>
       <w:pPr>
         <w:spacing w:after="0"/>
         <w:ind w:left="288" w:hanging="173"/>
+        <w:numPr>
+          <w:ilvl w:val="0"/>
+          <w:numId w:val="10"/>
+        </w:numPr>
       </w:pPr>
       <w:r>
-        <w:t>- Models &amp; Providers: Azure AI Foundry, OpenAI, Anthropic, Gemini, DeepSeek, Deepgram</w:t>
+        <w:t>Models &amp; Providers: Azure AI Foundry, OpenAI, Anthropic, Gemini, DeepSeek, Deepgram</w:t>
       </w:r>
     </w:p>
     <w:p>
       <w:pPr>
         <w:spacing w:after="0"/>
         <w:ind w:left="288" w:hanging="173"/>
+        <w:numPr>
+          <w:ilvl w:val="0"/>
+          <w:numId w:val="10"/>
+        </w:numPr>
       </w:pPr>
       <w:r>
-        <w:t>- ML &amp; Data: scikit-learn, XGBoost, pandas, feature engineering, temporal evaluation</w:t>
+        <w:t>ML &amp; Data: scikit-learn, XGBoost, pandas, feature engineering, temporal evaluation</w:t>
       </w:r>
     </w:p>
     <w:p>
       <w:pPr>
         <w:spacing w:after="0"/>
         <w:ind w:left="288" w:hanging="173"/>
+        <w:numPr>
+          <w:ilvl w:val="0"/>
+          <w:numId w:val="10"/>
+        </w:numPr>
       </w:pPr>
       <w:r>
-        <w:t>- Backend &amp; Automation: FastAPI, asyncio, REST APIs, n8n, webhooks, SQLAlchemy</w:t>
+        <w:t>Backend &amp; Automation: FastAPI, asyncio, REST APIs, n8n, webhooks, SQLAlchemy</w:t>
       </w:r>
     </w:p>
     <w:p>
       <w:pPr>
         <w:spacing w:after="0"/>
         <w:ind w:left="288" w:hanging="173"/>
+        <w:numPr>
+          <w:ilvl w:val="0"/>
+          <w:numId w:val="10"/>
+        </w:numPr>
       </w:pPr>
       <w:r>
-        <w:t>- Data &amp; Infrastructure: PostgreSQL, SQLite, Redis, Docker, GitHub Actions, Linux</w:t>
+        <w:t>Data &amp; Infrastructure: PostgreSQL, SQLite, Redis, Docker, GitHub Actions, Linux</w:t>
       </w:r>
     </w:p>
     <w:p>
       <w:pPr>
         <w:spacing w:after="0"/>
         <w:ind w:left="288" w:hanging="173"/>
+        <w:numPr>
+          <w:ilvl w:val="0"/>
+          <w:numId w:val="10"/>
+        </w:numPr>
       </w:pPr>
       <w:r>
-        <w:t>- Security: Suricata, Snort, VirusTotal API, OSINT, DNS analysis, secure credential management</w:t>
+        <w:t>Security: Suricata, Snort, VirusTotal API, OSINT, DNS analysis, secure credential management</w:t>
       </w:r>
     </w:p>
     <w:p>
       <w:pPr>
+        <w:pStyle w:val="Heading1"/>
         <w:spacing w:before="120" w:after="40"/>
       </w:pPr>
       <w:r>
@@ -221,27 +252,39 @@
       <w:pPr>
         <w:spacing w:after="0"/>
         <w:ind w:left="288" w:hanging="173"/>
+        <w:numPr>
+          <w:ilvl w:val="0"/>
+          <w:numId w:val="10"/>
+        </w:numPr>
       </w:pPr>
       <w:r>
-        <w:t>- Developing applied AI systems that combine model and provider integration, RAG and context assembly, voice and multimodal workflows, and structured outputs.</w:t>
+        <w:t>Developing applied AI systems that combine model and provider integration, retrieval and context assembly, voice and multimodal workflows, and structured outputs.</w:t>
       </w:r>
     </w:p>
     <w:p>
       <w:pPr>
         <w:spacing w:after="0"/>
         <w:ind w:left="288" w:hanging="173"/>
+        <w:numPr>
+          <w:ilvl w:val="0"/>
+          <w:numId w:val="10"/>
+        </w:numPr>
       </w:pPr>
       <w:r>
-        <w:t>- Building Python services and event-driven n8n workflows around external APIs, webhooks, validation, retries, logging, and human approval.</w:t>
+        <w:t>Building Python services and event-driven n8n workflows around external APIs, webhooks, validation, retries, logging, and human approval.</w:t>
       </w:r>
     </w:p>
     <w:p>
       <w:pPr>
         <w:spacing w:after="0"/>
         <w:ind w:left="288" w:hanging="173"/>
+        <w:numPr>
+          <w:ilvl w:val="0"/>
+          <w:numId w:val="10"/>
+        </w:numPr>
       </w:pPr>
       <w:r>
-        <w:t>- Exploring provider routing, fallback, cost, latency, and privacy trade-offs across Azure AI Foundry, OpenAI-compatible APIs, and transcription providers.</w:t>
+        <w:t>Exploring provider routing, fallback, cost, latency, and privacy trade-offs across Azure AI Foundry, OpenAI-compatible APIs, and transcription providers.</w:t>
       </w:r>
     </w:p>
     <w:p>
@@ -287,27 +330,39 @@
       <w:pPr>
         <w:spacing w:after="0"/>
         <w:ind w:left="288" w:hanging="173"/>
+        <w:numPr>
+          <w:ilvl w:val="0"/>
+          <w:numId w:val="10"/>
+        </w:numPr>
       </w:pPr>
       <w:r>
-        <w:t>- Built Python automation and backend utilities for data processing, Telegram bots, API integrations, and operational tooling.</w:t>
+        <w:t>Built Python automation and backend utilities for data processing, Telegram bots, API integrations, and operational tooling.</w:t>
       </w:r>
     </w:p>
     <w:p>
       <w:pPr>
         <w:spacing w:after="0"/>
         <w:ind w:left="288" w:hanging="173"/>
+        <w:numPr>
+          <w:ilvl w:val="0"/>
+          <w:numId w:val="10"/>
+        </w:numPr>
       </w:pPr>
       <w:r>
-        <w:t>- Created asynchronous VirusTotal scanning and multi-chain wallet analytics with validation, caching, pagination, and rate-limit handling.</w:t>
+        <w:t>Created asynchronous VirusTotal scanning and multi-chain wallet analytics with validation, caching, pagination, and rate-limit handling.</w:t>
       </w:r>
     </w:p>
     <w:p>
       <w:pPr>
         <w:spacing w:after="0"/>
         <w:ind w:left="288" w:hanging="173"/>
+        <w:numPr>
+          <w:ilvl w:val="0"/>
+          <w:numId w:val="10"/>
+        </w:numPr>
       </w:pPr>
       <w:r>
-        <w:t>- Developed and evaluated an experimental football forecasting pipeline with temporal features, calibrated models, FastAPI, and rolling-origin testing.</w:t>
+        <w:t>Developed and evaluated an experimental football forecasting pipeline with temporal features, calibrated models, FastAPI, and rolling-origin testing.</w:t>
       </w:r>
     </w:p>
     <w:p>
@@ -326,6 +381,7 @@
     </w:p>
     <w:p>
       <w:pPr>
+        <w:pStyle w:val="Heading1"/>
         <w:spacing w:before="120" w:after="40"/>
       </w:pPr>
       <w:r>
@@ -357,18 +413,26 @@
       <w:pPr>
         <w:spacing w:after="0"/>
         <w:ind w:left="288" w:hanging="173"/>
+        <w:numPr>
+          <w:ilvl w:val="0"/>
+          <w:numId w:val="10"/>
+        </w:numPr>
       </w:pPr>
       <w:r>
-        <w:t>- Deployed Suricata on Ubuntu, wrote custom Snort rules, and automated alert enrichment with Python and public OSINT sources.</w:t>
+        <w:t>Deployed Suricata on Ubuntu, wrote custom Snort rules, and automated alert enrichment with Python and public OSINT sources.</w:t>
       </w:r>
     </w:p>
     <w:p>
       <w:pPr>
         <w:spacing w:after="0"/>
         <w:ind w:left="288" w:hanging="173"/>
+        <w:numPr>
+          <w:ilvl w:val="0"/>
+          <w:numId w:val="10"/>
+        </w:numPr>
       </w:pPr>
       <w:r>
-        <w:t>- Built a DNS intelligence CLI with asynchronous resolution, WHOIS lookups, trace output, and JSON export.</w:t>
+        <w:t>Built a DNS intelligence CLI with asynchronous resolution, WHOIS lookups, trace output, and JSON export.</w:t>
       </w:r>
     </w:p>
     <w:p>
@@ -378,6 +442,7 @@
     </w:p>
     <w:p>
       <w:pPr>
+        <w:pStyle w:val="Heading1"/>
         <w:spacing w:before="120" w:after="40"/>
       </w:pPr>
       <w:r>
@@ -414,18 +479,26 @@
       <w:pPr>
         <w:spacing w:after="0"/>
         <w:ind w:left="288" w:hanging="173"/>
+        <w:numPr>
+          <w:ilvl w:val="0"/>
+          <w:numId w:val="10"/>
+        </w:numPr>
       </w:pPr>
       <w:r>
-        <w:t>- Restored FastAPI 0.140 compatibility by adapting FastStream's dependency layer to FastAPI's slotted Dependant model, preserving AsyncAPI metadata and adding nested-dependency regression coverage.</w:t>
+        <w:t>Restored FastAPI 0.140 compatibility by adapting FastStream's dependency layer to FastAPI's slotted Dependant model, preserving AsyncAPI metadata and adding nested-dependency regression coverage.</w:t>
       </w:r>
     </w:p>
     <w:p>
       <w:pPr>
         <w:spacing w:after="0"/>
         <w:ind w:left="288" w:hanging="173"/>
+        <w:numPr>
+          <w:ilvl w:val="0"/>
+          <w:numId w:val="10"/>
+        </w:numPr>
       </w:pPr>
       <w:r>
-        <w:t xml:space="preserve">- PR: </w:t>
+        <w:t xml:space="preserve">PR: </w:t>
       </w:r>
       <w:hyperlink r:id="rId14">
         <w:r>
@@ -464,18 +537,26 @@
       <w:pPr>
         <w:spacing w:after="0"/>
         <w:ind w:left="288" w:hanging="173"/>
+        <w:numPr>
+          <w:ilvl w:val="0"/>
+          <w:numId w:val="10"/>
+        </w:numPr>
       </w:pPr>
       <w:r>
-        <w:t>- Fixed pre-response WebSocket server-error frames bypassing the SDK retry policy, preserving overload and replay-safety boundaries with focused regression coverage.</w:t>
+        <w:t>Fixed pre-response WebSocket server-error frames bypassing the SDK retry policy, preserving overload and replay-safety boundaries with focused regression coverage.</w:t>
       </w:r>
     </w:p>
     <w:p>
       <w:pPr>
         <w:spacing w:after="0"/>
         <w:ind w:left="288" w:hanging="173"/>
+        <w:numPr>
+          <w:ilvl w:val="0"/>
+          <w:numId w:val="10"/>
+        </w:numPr>
       </w:pPr>
       <w:r>
-        <w:t xml:space="preserve">- PR: </w:t>
+        <w:t xml:space="preserve">PR: </w:t>
       </w:r>
       <w:hyperlink r:id="rId15">
         <w:r>
@@ -514,18 +595,26 @@
       <w:pPr>
         <w:spacing w:after="0"/>
         <w:ind w:left="288" w:hanging="173"/>
+        <w:numPr>
+          <w:ilvl w:val="0"/>
+          <w:numId w:val="10"/>
+        </w:numPr>
       </w:pPr>
       <w:r>
-        <w:t>- Fixed single-item workflow runs preparing unrelated subprojects, narrowing checks to the requested stage with root-project and subproject regression coverage.</w:t>
+        <w:t>Fixed single-item workflow runs preparing unrelated subprojects, narrowing checks to the requested stage with root-project and subproject regression coverage.</w:t>
       </w:r>
     </w:p>
     <w:p>
       <w:pPr>
         <w:spacing w:after="0"/>
         <w:ind w:left="288" w:hanging="173"/>
+        <w:numPr>
+          <w:ilvl w:val="0"/>
+          <w:numId w:val="10"/>
+        </w:numPr>
       </w:pPr>
       <w:r>
-        <w:t xml:space="preserve">- PR: </w:t>
+        <w:t xml:space="preserve">PR: </w:t>
       </w:r>
       <w:hyperlink r:id="rId16">
         <w:r>
@@ -540,6 +629,7 @@
     </w:p>
     <w:p>
       <w:pPr>
+        <w:pStyle w:val="Heading1"/>
         <w:spacing w:before="120" w:after="40"/>
       </w:pPr>
       <w:r>
@@ -576,36 +666,52 @@
       <w:pPr>
         <w:spacing w:after="0"/>
         <w:ind w:left="288" w:hanging="173"/>
+        <w:numPr>
+          <w:ilvl w:val="0"/>
+          <w:numId w:val="10"/>
+        </w:numPr>
       </w:pPr>
       <w:r>
-        <w:t>- Built and hardened a privacy-oriented macOS assistant combining selected screen context, microphone input, meeting audio, local OCR, relevance-ranked retrieval, and multiple AI providers.</w:t>
+        <w:t>Built and hardened a privacy-oriented macOS assistant combining selected screen context, microphone input, meeting audio, local OCR, relevance-ranked retrieval, and multiple AI providers.</w:t>
       </w:r>
     </w:p>
     <w:p>
       <w:pPr>
         <w:spacing w:after="0"/>
         <w:ind w:left="288" w:hanging="173"/>
+        <w:numPr>
+          <w:ilvl w:val="0"/>
+          <w:numId w:val="10"/>
+        </w:numPr>
       </w:pPr>
       <w:r>
-        <w:t>- Implemented bounded context memory, transcription and provider routing, explicit data-sharing controls, and cost-aware fallbacks.</w:t>
+        <w:t>Implemented bounded context memory, transcription and provider routing, explicit data-sharing controls, and cost-aware fallbacks.</w:t>
       </w:r>
     </w:p>
     <w:p>
       <w:pPr>
         <w:spacing w:after="0"/>
         <w:ind w:left="288" w:hanging="173"/>
+        <w:numPr>
+          <w:ilvl w:val="0"/>
+          <w:numId w:val="10"/>
+        </w:numPr>
       </w:pPr>
       <w:r>
-        <w:t>- Hardened Electron boundaries with sandboxing, context isolation, restricted IPC, automated tests, secret scanning, and release checks.</w:t>
+        <w:t>Hardened Electron boundaries with sandboxing, context isolation, restricted IPC, automated tests, secret scanning, and release checks.</w:t>
       </w:r>
     </w:p>
     <w:p>
       <w:pPr>
         <w:spacing w:after="0"/>
         <w:ind w:left="288" w:hanging="173"/>
+        <w:numPr>
+          <w:ilvl w:val="0"/>
+          <w:numId w:val="10"/>
+        </w:numPr>
       </w:pPr>
       <w:r>
-        <w:t xml:space="preserve">- Source: </w:t>
+        <w:t xml:space="preserve">Source: </w:t>
       </w:r>
       <w:hyperlink r:id="rId17">
         <w:r>
@@ -644,27 +750,39 @@
       <w:pPr>
         <w:spacing w:after="0"/>
         <w:ind w:left="288" w:hanging="173"/>
+        <w:numPr>
+          <w:ilvl w:val="0"/>
+          <w:numId w:val="10"/>
+        </w:numPr>
       </w:pPr>
       <w:r>
-        <w:t>- Built data scrapers, temporal feature engineering, XGBoost outcome and Poisson goal models, a FastAPI service, and a Streamlit dashboard.</w:t>
+        <w:t>Built data scrapers, temporal feature engineering, XGBoost outcome and Poisson goal models, a FastAPI service, and a Streamlit dashboard.</w:t>
       </w:r>
     </w:p>
     <w:p>
       <w:pPr>
         <w:spacing w:after="0"/>
         <w:ind w:left="288" w:hanging="173"/>
+        <w:numPr>
+          <w:ilvl w:val="0"/>
+          <w:numId w:val="10"/>
+        </w:numPr>
       </w:pPr>
       <w:r>
-        <w:t>- Evaluated with rolling-origin testing across 1,140 Premier League matches: 53.77% outcome accuracy versus a 56.70% bookmaker-implied benchmark, showing signal but no practical betting advantage.</w:t>
+        <w:t>Evaluated with rolling-origin testing across 1,140 Premier League matches: 53.77% outcome accuracy versus a 56.70% bookmaker-implied benchmark, showing signal but no practical betting advantage.</w:t>
       </w:r>
     </w:p>
     <w:p>
       <w:pPr>
         <w:spacing w:after="0"/>
         <w:ind w:left="288" w:hanging="173"/>
+        <w:numPr>
+          <w:ilvl w:val="0"/>
+          <w:numId w:val="10"/>
+        </w:numPr>
       </w:pPr>
       <w:r>
-        <w:t xml:space="preserve">- Source: </w:t>
+        <w:t xml:space="preserve">Source: </w:t>
       </w:r>
       <w:hyperlink r:id="rId18">
         <w:r>
@@ -703,27 +821,39 @@
       <w:pPr>
         <w:spacing w:after="0"/>
         <w:ind w:left="288" w:hanging="173"/>
+        <w:numPr>
+          <w:ilvl w:val="0"/>
+          <w:numId w:val="10"/>
+        </w:numPr>
       </w:pPr>
       <w:r>
-        <w:t>- Built signed guest sessions, server-authoritative moves, reconnect and forfeit handling, transactional match settlement, and an append-only currency ledger.</w:t>
+        <w:t>Built signed guest sessions, server-authoritative moves, reconnect and forfeit handling, transactional match settlement, and an append-only currency ledger.</w:t>
       </w:r>
     </w:p>
     <w:p>
       <w:pPr>
         <w:spacing w:after="0"/>
         <w:ind w:left="288" w:hanging="173"/>
+        <w:numPr>
+          <w:ilvl w:val="0"/>
+          <w:numId w:val="10"/>
+        </w:numPr>
       </w:pPr>
       <w:r>
-        <w:t>- Added idempotent Paystack crediting plus automated API, economy, room-state, and two-client Socket.IO tests.</w:t>
+        <w:t>Added idempotent Paystack crediting plus automated API, economy, room-state, and two-client Socket.IO tests.</w:t>
       </w:r>
     </w:p>
     <w:p>
       <w:pPr>
         <w:spacing w:after="0"/>
         <w:ind w:left="288" w:hanging="173"/>
+        <w:numPr>
+          <w:ilvl w:val="0"/>
+          <w:numId w:val="10"/>
+        </w:numPr>
       </w:pPr>
       <w:r>
-        <w:t xml:space="preserve">- Live: </w:t>
+        <w:t xml:space="preserve">Live: </w:t>
       </w:r>
       <w:hyperlink r:id="rId19">
         <w:r>
@@ -750,6 +880,7 @@
     </w:p>
     <w:p>
       <w:pPr>
+        <w:pStyle w:val="Heading1"/>
         <w:spacing w:before="120" w:after="40"/>
       </w:pPr>
       <w:r>
@@ -764,22 +895,31 @@
       <w:pPr>
         <w:spacing w:after="0"/>
         <w:ind w:left="288" w:hanging="173"/>
+        <w:numPr>
+          <w:ilvl w:val="0"/>
+          <w:numId w:val="10"/>
+        </w:numPr>
       </w:pPr>
       <w:r>
-        <w:t>- Google AI Professional Certificate | Coursera</w:t>
+        <w:t>Google AI Professional Certificate | Coursera</w:t>
       </w:r>
     </w:p>
     <w:p>
       <w:pPr>
         <w:spacing w:after="0"/>
         <w:ind w:left="288" w:hanging="173"/>
+        <w:numPr>
+          <w:ilvl w:val="0"/>
+          <w:numId w:val="10"/>
+        </w:numPr>
       </w:pPr>
       <w:r>
-        <w:t>- Google Cybersecurity Professional Certificate | Coursera</w:t>
+        <w:t>Google Cybersecurity Professional Certificate | Coursera</w:t>
       </w:r>
     </w:p>
     <w:p>
       <w:pPr>
+        <w:pStyle w:val="Heading1"/>
         <w:spacing w:before="120" w:after="40"/>
       </w:pPr>
       <w:r>
@@ -1034,6 +1174,15 @@
   </w:num>
   <w:num w:numId="9">
     <w:abstractNumId w:val="0"/>
+  </w:num>
+  <w:abstractNum w:abstractNumId="9">
+    <w:lvl w:ilvl="0">
+      <w:numFmt w:val="bullet"/>
+      <w:lvlText w:val="•"/>
+    </w:lvl>
+  </w:abstractNum>
+  <w:num w:numId="10">
+    <w:abstractNumId w:val="9"/>
   </w:num>
 </w:numbering>
 </file>

</xml_diff>

<commit_message>
feat: refine portfolio contribution rails
</commit_message>
<xml_diff>
--- a/public/Joshua_Nwachinemere_CV.docx
+++ b/public/Joshua_Nwachinemere_CV.docx
@@ -461,64 +461,6 @@
         <w:rPr>
           <w:b/>
         </w:rPr>
-        <w:t>FastStream | Merged PR #2961</w:t>
-      </w:r>
-    </w:p>
-    <w:p>
-      <w:pPr>
-        <w:spacing w:after="0"/>
-      </w:pPr>
-      <w:r>
-        <w:rPr>
-          <w:i/>
-        </w:rPr>
-        <w:t>Python, FastAPI compatibility, dependency injection, AsyncAPI, pytest | Jul 2026</w:t>
-      </w:r>
-    </w:p>
-    <w:p>
-      <w:pPr>
-        <w:spacing w:after="0"/>
-        <w:ind w:left="288" w:hanging="173"/>
-        <w:numPr>
-          <w:ilvl w:val="0"/>
-          <w:numId w:val="10"/>
-        </w:numPr>
-      </w:pPr>
-      <w:r>
-        <w:t>Restored FastAPI 0.140 compatibility by adapting FastStream's dependency layer to FastAPI's slotted Dependant model, preserving AsyncAPI metadata and adding nested-dependency regression coverage.</w:t>
-      </w:r>
-    </w:p>
-    <w:p>
-      <w:pPr>
-        <w:spacing w:after="0"/>
-        <w:ind w:left="288" w:hanging="173"/>
-        <w:numPr>
-          <w:ilvl w:val="0"/>
-          <w:numId w:val="10"/>
-        </w:numPr>
-      </w:pPr>
-      <w:r>
-        <w:t xml:space="preserve">PR: </w:t>
-      </w:r>
-      <w:hyperlink r:id="rId14">
-        <w:r>
-          <w:rPr>
-            <w:color w:val="1155CC"/>
-            <w:u w:val="single"/>
-          </w:rPr>
-          <w:t>https://github.com/ag2ai/faststream/pull/2961</w:t>
-        </w:r>
-      </w:hyperlink>
-      <w:r/>
-    </w:p>
-    <w:p>
-      <w:pPr>
-        <w:spacing w:after="0"/>
-      </w:pPr>
-      <w:r>
-        <w:rPr>
-          <w:b/>
-        </w:rPr>
         <w:t>OpenAI Agents Python SDK | Merged PR #3991</w:t>
       </w:r>
     </w:p>
@@ -543,7 +485,65 @@
         </w:numPr>
       </w:pPr>
       <w:r>
-        <w:t>Fixed pre-response WebSocket server-error frames bypassing the SDK retry policy, preserving overload and replay-safety boundaries with focused regression coverage.</w:t>
+        <w:t>Made transient pre-response WebSocket server errors follow the SDK's retry policy while preserving non-transient handling and replay-safety checks.</w:t>
+      </w:r>
+    </w:p>
+    <w:p>
+      <w:pPr>
+        <w:spacing w:after="0"/>
+        <w:ind w:left="288" w:hanging="173"/>
+        <w:numPr>
+          <w:ilvl w:val="0"/>
+          <w:numId w:val="10"/>
+        </w:numPr>
+      </w:pPr>
+      <w:r>
+        <w:t xml:space="preserve">PR: </w:t>
+      </w:r>
+      <w:hyperlink r:id="rId14">
+        <w:r>
+          <w:rPr>
+            <w:color w:val="1155CC"/>
+            <w:u w:val="single"/>
+          </w:rPr>
+          <w:t>https://github.com/openai/openai-agents-python/pull/3991</w:t>
+        </w:r>
+      </w:hyperlink>
+      <w:r/>
+    </w:p>
+    <w:p>
+      <w:pPr>
+        <w:spacing w:after="0"/>
+      </w:pPr>
+      <w:r>
+        <w:rPr>
+          <w:b/>
+        </w:rPr>
+        <w:t>Pydantic AI Harness | Merged PR #503</w:t>
+      </w:r>
+    </w:p>
+    <w:p>
+      <w:pPr>
+        <w:spacing w:after="0"/>
+      </w:pPr>
+      <w:r>
+        <w:rPr>
+          <w:i/>
+        </w:rPr>
+        <w:t>Python, agent recovery, Code Mode, pytest | Jul 2026</w:t>
+      </w:r>
+    </w:p>
+    <w:p>
+      <w:pPr>
+        <w:spacing w:after="0"/>
+        <w:ind w:left="288" w:hanging="173"/>
+        <w:numPr>
+          <w:ilvl w:val="0"/>
+          <w:numId w:val="10"/>
+        </w:numPr>
+      </w:pPr>
+      <w:r>
+        <w:t>Surfaced unexpected Code Mode execution failures to the model as retries after resetting invalid session state, enabling recovery from lost imports and variables.</w:t>
       </w:r>
     </w:p>
     <w:p>
@@ -564,7 +564,7 @@
             <w:color w:val="1155CC"/>
             <w:u w:val="single"/>
           </w:rPr>
-          <w:t>https://github.com/openai/openai-agents-python/pull/3991</w:t>
+          <w:t>https://github.com/pydantic/pydantic-ai-harness/pull/503</w:t>
         </w:r>
       </w:hyperlink>
       <w:r/>
@@ -577,7 +577,7 @@
         <w:rPr>
           <w:b/>
         </w:rPr>
-        <w:t>Calkit | Merged PR #1028</w:t>
+        <w:t>Mellea | Merged PR #1471</w:t>
       </w:r>
     </w:p>
     <w:p>
@@ -588,7 +588,7 @@
         <w:rPr>
           <w:i/>
         </w:rPr>
-        <w:t>Python, CLI workflow execution, pytest | Jul 2026</w:t>
+        <w:t>Python, OpenTelemetry tracing, async tests, pytest | Jul 2026</w:t>
       </w:r>
     </w:p>
     <w:p>
@@ -601,7 +601,7 @@
         </w:numPr>
       </w:pPr>
       <w:r>
-        <w:t>Fixed single-item workflow runs preparing unrelated subprojects, narrowing checks to the requested stage with root-project and subproject regression coverage.</w:t>
+        <w:t>Added deterministic mocked-backend tests for async span timing, context propagation, token usage, span lifetime, and consecutive generations.</w:t>
       </w:r>
     </w:p>
     <w:p>
@@ -617,6 +617,145 @@
         <w:t xml:space="preserve">PR: </w:t>
       </w:r>
       <w:hyperlink r:id="rId16">
+        <w:r>
+          <w:rPr>
+            <w:color w:val="1155CC"/>
+            <w:u w:val="single"/>
+          </w:rPr>
+          <w:t>https://github.com/generative-computing/mellea/pull/1471</w:t>
+        </w:r>
+      </w:hyperlink>
+      <w:r/>
+    </w:p>
+    <w:p>
+      <w:pPr>
+        <w:spacing w:after="0"/>
+      </w:pPr>
+      <w:r>
+        <w:rPr>
+          <w:b/>
+        </w:rPr>
+        <w:t>FastStream | Merged PR #2961</w:t>
+      </w:r>
+    </w:p>
+    <w:p>
+      <w:pPr>
+        <w:spacing w:after="0"/>
+      </w:pPr>
+      <w:r>
+        <w:rPr>
+          <w:i/>
+        </w:rPr>
+        <w:t>Python, FastAPI compatibility, dependency injection, pytest | Jul 2026</w:t>
+      </w:r>
+    </w:p>
+    <w:p>
+      <w:pPr>
+        <w:spacing w:after="0"/>
+        <w:ind w:left="288" w:hanging="173"/>
+        <w:numPr>
+          <w:ilvl w:val="0"/>
+          <w:numId w:val="10"/>
+        </w:numPr>
+      </w:pPr>
+      <w:r>
+        <w:t>Restored FastAPI 0.140 compatibility for slotted Dependant objects while retaining native dependency fields and FastStream schema metadata.</w:t>
+      </w:r>
+    </w:p>
+    <w:p>
+      <w:pPr>
+        <w:spacing w:after="0"/>
+        <w:ind w:left="288" w:hanging="173"/>
+        <w:numPr>
+          <w:ilvl w:val="0"/>
+          <w:numId w:val="10"/>
+        </w:numPr>
+      </w:pPr>
+      <w:r>
+        <w:t xml:space="preserve">PR: </w:t>
+      </w:r>
+      <w:hyperlink r:id="rId17">
+        <w:r>
+          <w:rPr>
+            <w:color w:val="1155CC"/>
+            <w:u w:val="single"/>
+          </w:rPr>
+          <w:t>https://github.com/ag2ai/faststream/pull/2961</w:t>
+        </w:r>
+      </w:hyperlink>
+      <w:r/>
+    </w:p>
+    <w:p>
+      <w:pPr>
+        <w:spacing w:after="0"/>
+      </w:pPr>
+      <w:r>
+        <w:rPr>
+          <w:b/>
+        </w:rPr>
+        <w:t>Additional verified upstream merges | 4 of 8 merged PRs</w:t>
+      </w:r>
+    </w:p>
+    <w:p>
+      <w:pPr>
+        <w:spacing w:after="0"/>
+      </w:pPr>
+      <w:r>
+        <w:rPr>
+          <w:i/>
+        </w:rPr>
+        <w:t>Correctness, dependency errors, schema generation, workflow scoping | Jul 2026</w:t>
+      </w:r>
+    </w:p>
+    <w:p>
+      <w:pPr>
+        <w:spacing w:after="0"/>
+        <w:ind w:left="288" w:hanging="173"/>
+        <w:numPr>
+          <w:ilvl w:val="0"/>
+          <w:numId w:val="10"/>
+        </w:numPr>
+      </w:pPr>
+      <w:r>
+        <w:t xml:space="preserve">Apache Arrow Rust: </w:t>
+      </w:r>
+      <w:hyperlink r:id="rId18">
+        <w:r>
+          <w:rPr>
+            <w:color w:val="1155CC"/>
+            <w:u w:val="single"/>
+          </w:rPr>
+          <w:t>https://github.com/apache/arrow-rs/pull/10486</w:t>
+        </w:r>
+      </w:hyperlink>
+      <w:r>
+        <w:t xml:space="preserve"> | Altair: </w:t>
+      </w:r>
+      <w:hyperlink r:id="rId19">
+        <w:r>
+          <w:rPr>
+            <w:color w:val="1155CC"/>
+            <w:u w:val="single"/>
+          </w:rPr>
+          <w:t>https://github.com/vega/altair/pull/4089</w:t>
+        </w:r>
+      </w:hyperlink>
+      <w:r>
+        <w:t xml:space="preserve"> | FastStream FastAPI: </w:t>
+      </w:r>
+      <w:hyperlink r:id="rId20">
+        <w:r>
+          <w:rPr>
+            <w:color w:val="1155CC"/>
+            <w:u w:val="single"/>
+          </w:rPr>
+          <w:t>https://github.com/faststream-community/faststream_fastapi/pull/2</w:t>
+        </w:r>
+      </w:hyperlink>
+      <w:r>
+        <w:t xml:space="preserve"> | Calkit: </w:t>
+      </w:r>
+      <w:hyperlink r:id="rId21">
         <w:r>
           <w:rPr>
             <w:color w:val="1155CC"/>
@@ -713,7 +852,7 @@
       <w:r>
         <w:t xml:space="preserve">Source: </w:t>
       </w:r>
-      <w:hyperlink r:id="rId17">
+      <w:hyperlink r:id="rId22">
         <w:r>
           <w:rPr>
             <w:color w:val="1155CC"/>
@@ -784,7 +923,7 @@
       <w:r>
         <w:t xml:space="preserve">Source: </w:t>
       </w:r>
-      <w:hyperlink r:id="rId18">
+      <w:hyperlink r:id="rId23">
         <w:r>
           <w:rPr>
             <w:color w:val="1155CC"/>
@@ -855,7 +994,7 @@
       <w:r>
         <w:t xml:space="preserve">Live: </w:t>
       </w:r>
-      <w:hyperlink r:id="rId19">
+      <w:hyperlink r:id="rId24">
         <w:r>
           <w:rPr>
             <w:color w:val="1155CC"/>
@@ -867,7 +1006,7 @@
       <w:r>
         <w:t xml:space="preserve"> | Source: </w:t>
       </w:r>
-      <w:hyperlink r:id="rId20">
+      <w:hyperlink r:id="rId25">
         <w:r>
           <w:rPr>
             <w:color w:val="1155CC"/>

</xml_diff>

<commit_message>
add selected credential evidence
</commit_message>
<xml_diff>
--- a/public/Joshua_Nwachinemere_CV.docx
+++ b/public/Joshua_Nwachinemere_CV.docx
@@ -1027,7 +1027,7 @@
           <w:b/>
           <w:sz w:val="23"/>
         </w:rPr>
-        <w:t>CERTIFICATIONS</w:t>
+        <w:t>CERTIFICATIONS &amp; TRAINING</w:t>
       </w:r>
     </w:p>
     <w:p>
@@ -1040,8 +1040,17 @@
         </w:numPr>
       </w:pPr>
       <w:r>
-        <w:t>Google AI Professional Certificate | Coursera</w:t>
+        <w:t xml:space="preserve">Scientific Computing with Python Developer Certification | freeCodeCamp | May 2026 | </w:t>
       </w:r>
+      <w:hyperlink r:id="rId26">
+        <w:r>
+          <w:rPr>
+            <w:color w:val="1155CC"/>
+            <w:u w:val="single"/>
+          </w:rPr>
+          <w:t>Verify credential</w:t>
+        </w:r>
+      </w:hyperlink>
     </w:p>
     <w:p>
       <w:pPr>
@@ -1053,8 +1062,39 @@
         </w:numPr>
       </w:pPr>
       <w:r>
-        <w:t>Google Cybersecurity Professional Certificate | Coursera</w:t>
+        <w:t xml:space="preserve">Google AI Specialization | Google/Coursera | February 2026 | </w:t>
       </w:r>
+      <w:hyperlink r:id="rId27">
+        <w:r>
+          <w:rPr>
+            <w:color w:val="1155CC"/>
+            <w:u w:val="single"/>
+          </w:rPr>
+          <w:t>Verify credential</w:t>
+        </w:r>
+      </w:hyperlink>
+    </w:p>
+    <w:p>
+      <w:pPr>
+        <w:spacing w:after="0"/>
+        <w:ind w:left="288" w:hanging="173"/>
+        <w:numPr>
+          <w:ilvl w:val="0"/>
+          <w:numId w:val="10"/>
+        </w:numPr>
+      </w:pPr>
+      <w:r>
+        <w:t xml:space="preserve">Model Context Protocol: Advanced Topics | Anthropic training | March 2026 | </w:t>
+      </w:r>
+      <w:hyperlink r:id="rId28">
+        <w:r>
+          <w:rPr>
+            <w:color w:val="1155CC"/>
+            <w:u w:val="single"/>
+          </w:rPr>
+          <w:t>Verify credential</w:t>
+        </w:r>
+      </w:hyperlink>
     </w:p>
     <w:p>
       <w:pPr>
@@ -1074,7 +1114,7 @@
         <w:spacing w:after="0"/>
       </w:pPr>
       <w:r>
-        <w:t>Bachelor of Technology (BTech), Mathematics | 2016 - 2021</w:t>
+        <w:t>Bachelor of Technology (BTech), Mathematics · Federal University of Technology, Owerri (FUTO) · 2016–2021</w:t>
       </w:r>
     </w:p>
     <w:p>
@@ -1082,7 +1122,7 @@
         <w:spacing w:after="0"/>
       </w:pPr>
       <w:r>
-        <w:t>Federal University of Technology, Owerri (FUTO)</w:t>
+        <w:t>MSc Artificial Intelligence · Northumbria University · September 2026 intake</w:t>
       </w:r>
     </w:p>
     <w:sectPr>

</xml_diff>

<commit_message>
Update CV content and artifacts
Updates the CV content and generated artifacts, expands verified freelance Python automation experience, and strengthens document-generation regression coverage.
</commit_message>
<xml_diff>
--- a/public/Joshua_Nwachinemere_CV.docx
+++ b/public/Joshua_Nwachinemere_CV.docx
@@ -25,7 +25,7 @@
           <w:b/>
           <w:sz w:val="21"/>
         </w:rPr>
-        <w:t>AI Engineer | Python, Retrieval, Context Engineering, Multimodal AI &amp; ML Evaluation</w:t>
+        <w:t>AI Engineer | Python, Retrieval Systems, Multimodal AI &amp; ML Evaluation</w:t>
       </w:r>
     </w:p>
     <w:p>
@@ -103,7 +103,7 @@
         <w:spacing w:after="40"/>
       </w:pPr>
       <w:r>
-        <w:t>AI Engineer building Python systems around language, vision, and speech models. Work spans retrieval and context assembly, multimodal inputs, real-time transcription, model/API integration, FastAPI services, asynchronous workflows, and ML evaluation. Building VolyxAI with explicit data flow, validation, observability, and human control. Open to AI Engineer and ML Engineer opportunities.</w:t>
+        <w:t>AI Engineer building Python systems for retrieval, multimodal inference, speech, model APIs, and ML evaluation. Built local review intelligence with citation validation and benchmarked evaluation, a privacy-oriented macOS assistant, and a temporal forecasting pipeline. Contributed eight merged fixes and tests across AI and data infrastructure projects, including OpenAI Agents SDK and Pydantic AI Harness.</w:t>
       </w:r>
     </w:p>
     <w:p>
@@ -116,7 +116,29 @@
           <w:b/>
           <w:sz w:val="23"/>
         </w:rPr>
-        <w:t>CORE SKILLS</w:t>
+        <w:t>SELECTED AI &amp; ML PROJECTS</w:t>
+      </w:r>
+    </w:p>
+    <w:p>
+      <w:pPr>
+        <w:spacing w:after="0"/>
+      </w:pPr>
+      <w:r>
+        <w:rPr>
+          <w:b/>
+        </w:rPr>
+        <w:t>Local Review Intelligence | Local Retrieval &amp; Evaluation</w:t>
+      </w:r>
+    </w:p>
+    <w:p>
+      <w:pPr>
+        <w:spacing w:after="0"/>
+      </w:pPr>
+      <w:r>
+        <w:rPr>
+          <w:i/>
+        </w:rPr>
+        <w:t>Python, Ollama, ChromaDB, LangChain, Streamlit</w:t>
       </w:r>
     </w:p>
     <w:p>
@@ -129,7 +151,7 @@
         </w:numPr>
       </w:pPr>
       <w:r>
-        <w:t>Languages: Python, SQL</w:t>
+        <w:t>Built a local-first review intelligence application with adaptive CSV mapping, content-addressed Chroma storage, reconciled indexing, a Streamlit dashboard, and an installable CLI.</w:t>
       </w:r>
     </w:p>
     <w:p>
@@ -142,7 +164,7 @@
         </w:numPr>
       </w:pPr>
       <w:r>
-        <w:t>AI Engineering: retrieval, context engineering, multimodal inference, voice AI, structured outputs, provider routing, model evaluation</w:t>
+        <w:t>Implemented stable source IDs, validated citations, bounded answer repair, safe abstention, and a versioned 30-case evaluation comparing semantic retrieval with BM25.</w:t>
       </w:r>
     </w:p>
     <w:p>
@@ -155,350 +177,7 @@
         </w:numPr>
       </w:pPr>
       <w:r>
-        <w:t>Models &amp; Providers: Azure AI Foundry, OpenAI, Anthropic, Gemini, DeepSeek, Deepgram</w:t>
-      </w:r>
-    </w:p>
-    <w:p>
-      <w:pPr>
-        <w:spacing w:after="0"/>
-        <w:ind w:left="288" w:hanging="173"/>
-        <w:numPr>
-          <w:ilvl w:val="0"/>
-          <w:numId w:val="10"/>
-        </w:numPr>
-      </w:pPr>
-      <w:r>
-        <w:t>ML &amp; Data: scikit-learn, XGBoost, pandas, feature engineering, temporal evaluation</w:t>
-      </w:r>
-    </w:p>
-    <w:p>
-      <w:pPr>
-        <w:spacing w:after="0"/>
-        <w:ind w:left="288" w:hanging="173"/>
-        <w:numPr>
-          <w:ilvl w:val="0"/>
-          <w:numId w:val="10"/>
-        </w:numPr>
-      </w:pPr>
-      <w:r>
-        <w:t>Backend &amp; Automation: FastAPI, asyncio, REST APIs, n8n, webhooks, SQLAlchemy</w:t>
-      </w:r>
-    </w:p>
-    <w:p>
-      <w:pPr>
-        <w:spacing w:after="0"/>
-        <w:ind w:left="288" w:hanging="173"/>
-        <w:numPr>
-          <w:ilvl w:val="0"/>
-          <w:numId w:val="10"/>
-        </w:numPr>
-      </w:pPr>
-      <w:r>
-        <w:t>Data &amp; Infrastructure: PostgreSQL, SQLite, Redis, Docker, GitHub Actions, Linux</w:t>
-      </w:r>
-    </w:p>
-    <w:p>
-      <w:pPr>
-        <w:spacing w:after="0"/>
-        <w:ind w:left="288" w:hanging="173"/>
-        <w:numPr>
-          <w:ilvl w:val="0"/>
-          <w:numId w:val="10"/>
-        </w:numPr>
-      </w:pPr>
-      <w:r>
-        <w:t>Security: Suricata, Snort, VirusTotal API, OSINT, DNS analysis, secure credential management</w:t>
-      </w:r>
-    </w:p>
-    <w:p>
-      <w:pPr>
-        <w:pStyle w:val="Heading1"/>
-        <w:spacing w:before="120" w:after="40"/>
-      </w:pPr>
-      <w:r>
-        <w:rPr>
-          <w:b/>
-          <w:sz w:val="23"/>
-        </w:rPr>
-        <w:t>INDEPENDENT PRODUCT &amp; ENGINEERING WORK</w:t>
-      </w:r>
-    </w:p>
-    <w:p>
-      <w:pPr>
-        <w:spacing w:after="0"/>
-      </w:pPr>
-      <w:r>
-        <w:rPr>
-          <w:b/>
-        </w:rPr>
-        <w:t>AI Engineer · VolyxAI product work</w:t>
-      </w:r>
-      <w:r>
-        <w:rPr>
-          <w:i/>
-        </w:rPr>
-        <w:t xml:space="preserve"> | Nov 2025 - Present</w:t>
-      </w:r>
-    </w:p>
-    <w:p>
-      <w:pPr>
-        <w:spacing w:after="0"/>
-      </w:pPr>
-      <w:r>
-        <w:t>Independent product effort</w:t>
-      </w:r>
-    </w:p>
-    <w:p>
-      <w:pPr>
-        <w:spacing w:after="0"/>
-        <w:ind w:left="288" w:hanging="173"/>
-        <w:numPr>
-          <w:ilvl w:val="0"/>
-          <w:numId w:val="10"/>
-        </w:numPr>
-      </w:pPr>
-      <w:r>
-        <w:t>Developing applied AI systems that combine model and provider integration, retrieval and context assembly, voice and multimodal workflows, and structured outputs.</w:t>
-      </w:r>
-    </w:p>
-    <w:p>
-      <w:pPr>
-        <w:spacing w:after="0"/>
-        <w:ind w:left="288" w:hanging="173"/>
-        <w:numPr>
-          <w:ilvl w:val="0"/>
-          <w:numId w:val="10"/>
-        </w:numPr>
-      </w:pPr>
-      <w:r>
-        <w:t>Building Python services and event-driven n8n workflows around external APIs, webhooks, validation, retries, logging, and human approval.</w:t>
-      </w:r>
-    </w:p>
-    <w:p>
-      <w:pPr>
-        <w:spacing w:after="0"/>
-        <w:ind w:left="288" w:hanging="173"/>
-        <w:numPr>
-          <w:ilvl w:val="0"/>
-          <w:numId w:val="10"/>
-        </w:numPr>
-      </w:pPr>
-      <w:r>
-        <w:t>Exploring provider routing, fallback, cost, latency, and privacy trade-offs across Azure AI Foundry, OpenAI-compatible APIs, and transcription providers.</w:t>
-      </w:r>
-    </w:p>
-    <w:p>
-      <w:pPr>
-        <w:spacing w:after="40"/>
-      </w:pPr>
-      <w:r>
-        <w:rPr>
-          <w:b/>
-        </w:rPr>
-        <w:t xml:space="preserve">Key tools: </w:t>
-      </w:r>
-      <w:r>
-        <w:t>Python, FastAPI, n8n, REST APIs, webhooks, Azure AI Foundry, OpenAI-compatible APIs, PostgreSQL, Redis</w:t>
-      </w:r>
-    </w:p>
-    <w:p>
-      <w:pPr>
-        <w:spacing w:after="0"/>
-      </w:pPr>
-      <w:r>
-        <w:rPr>
-          <w:b/>
-        </w:rPr>
-        <w:t>AI, Backend &amp; Automation Projects</w:t>
-      </w:r>
-      <w:r>
-        <w:rPr>
-          <w:i/>
-        </w:rPr>
-        <w:t xml:space="preserve"> | Jan 2021 - Present</w:t>
-      </w:r>
-    </w:p>
-    <w:p>
-      <w:pPr>
-        <w:spacing w:after="0"/>
-      </w:pPr>
-      <w:r>
-        <w:t>Independent engineering work</w:t>
-      </w:r>
-    </w:p>
-    <w:p>
-      <w:pPr>
-        <w:spacing w:after="0"/>
-        <w:ind w:left="288" w:hanging="173"/>
-        <w:numPr>
-          <w:ilvl w:val="0"/>
-          <w:numId w:val="10"/>
-        </w:numPr>
-      </w:pPr>
-      <w:r>
-        <w:t>Built Python automation and backend utilities for data processing, Telegram bots, API integrations, and operational tooling.</w:t>
-      </w:r>
-    </w:p>
-    <w:p>
-      <w:pPr>
-        <w:spacing w:after="0"/>
-        <w:ind w:left="288" w:hanging="173"/>
-        <w:numPr>
-          <w:ilvl w:val="0"/>
-          <w:numId w:val="10"/>
-        </w:numPr>
-      </w:pPr>
-      <w:r>
-        <w:t>Created asynchronous VirusTotal scanning and multi-chain wallet analytics with validation, caching, pagination, and rate-limit handling.</w:t>
-      </w:r>
-    </w:p>
-    <w:p>
-      <w:pPr>
-        <w:spacing w:after="0"/>
-        <w:ind w:left="288" w:hanging="173"/>
-        <w:numPr>
-          <w:ilvl w:val="0"/>
-          <w:numId w:val="10"/>
-        </w:numPr>
-      </w:pPr>
-      <w:r>
-        <w:t>Developed and evaluated an experimental football forecasting pipeline with temporal features, calibrated models, FastAPI, and rolling-origin testing.</w:t>
-      </w:r>
-    </w:p>
-    <w:p>
-      <w:pPr>
-        <w:spacing w:after="40"/>
-      </w:pPr>
-      <w:r>
-        <w:rPr>
-          <w:b/>
-        </w:rPr>
-        <w:t xml:space="preserve">Key tools: </w:t>
-      </w:r>
-      <w:r>
-        <w:t>Python, Async I/O, Telegram Bot API, aiohttp, SQL, Docker, REST APIs</w:t>
-      </w:r>
-    </w:p>
-    <w:p>
-      <w:pPr>
-        <w:pStyle w:val="Heading1"/>
-        <w:spacing w:before="120" w:after="40"/>
-      </w:pPr>
-      <w:r>
-        <w:rPr>
-          <w:b/>
-          <w:sz w:val="23"/>
-        </w:rPr>
-        <w:t>TECHNICAL TRAINING</w:t>
-      </w:r>
-    </w:p>
-    <w:p>
-      <w:pPr>
-        <w:spacing w:after="0"/>
-      </w:pPr>
-      <w:r>
-        <w:rPr>
-          <w:b/>
-        </w:rPr>
-        <w:t>Threat Detection &amp; Response Capstone | Capstone IT Staffing (Remote)</w:t>
-      </w:r>
-      <w:r>
-        <w:rPr>
-          <w:i/>
-        </w:rPr>
-        <w:t xml:space="preserve"> | Jul 2025 - Aug 2025</w:t>
-      </w:r>
-    </w:p>
-    <w:p>
-      <w:pPr>
-        <w:spacing w:after="0"/>
-        <w:ind w:left="288" w:hanging="173"/>
-        <w:numPr>
-          <w:ilvl w:val="0"/>
-          <w:numId w:val="10"/>
-        </w:numPr>
-      </w:pPr>
-      <w:r>
-        <w:t>Deployed Suricata on Ubuntu, wrote custom Snort rules, and automated alert enrichment with Python and public OSINT sources.</w:t>
-      </w:r>
-    </w:p>
-    <w:p>
-      <w:pPr>
-        <w:spacing w:after="0"/>
-        <w:ind w:left="288" w:hanging="173"/>
-        <w:numPr>
-          <w:ilvl w:val="0"/>
-          <w:numId w:val="10"/>
-        </w:numPr>
-      </w:pPr>
-      <w:r>
-        <w:t>Built a DNS intelligence CLI with asynchronous resolution, WHOIS lookups, trace output, and JSON export.</w:t>
-      </w:r>
-    </w:p>
-    <w:p>
-      <w:r>
-        <w:br w:type="page"/>
-      </w:r>
-    </w:p>
-    <w:p>
-      <w:pPr>
-        <w:pStyle w:val="Heading1"/>
-        <w:spacing w:before="120" w:after="40"/>
-      </w:pPr>
-      <w:r>
-        <w:rPr>
-          <w:b/>
-          <w:sz w:val="23"/>
-        </w:rPr>
-        <w:t>OPEN-SOURCE CONTRIBUTIONS</w:t>
-      </w:r>
-    </w:p>
-    <w:p>
-      <w:pPr>
-        <w:spacing w:after="0"/>
-      </w:pPr>
-      <w:r>
-        <w:rPr>
-          <w:b/>
-        </w:rPr>
-        <w:t>OpenAI Agents Python SDK | Merged PR #3991</w:t>
-      </w:r>
-    </w:p>
-    <w:p>
-      <w:pPr>
-        <w:spacing w:after="0"/>
-      </w:pPr>
-      <w:r>
-        <w:rPr>
-          <w:i/>
-        </w:rPr>
-        <w:t>Python, WebSockets, retry policies, pytest | Jul 2026</w:t>
-      </w:r>
-    </w:p>
-    <w:p>
-      <w:pPr>
-        <w:spacing w:after="0"/>
-        <w:ind w:left="288" w:hanging="173"/>
-        <w:numPr>
-          <w:ilvl w:val="0"/>
-          <w:numId w:val="10"/>
-        </w:numPr>
-      </w:pPr>
-      <w:r>
-        <w:t>Made transient pre-response WebSocket server errors follow the SDK's retry policy while preserving non-transient handling and replay-safety checks.</w:t>
-      </w:r>
-    </w:p>
-    <w:p>
-      <w:pPr>
-        <w:spacing w:after="0"/>
-        <w:ind w:left="288" w:hanging="173"/>
-        <w:numPr>
-          <w:ilvl w:val="0"/>
-          <w:numId w:val="10"/>
-        </w:numPr>
-      </w:pPr>
-      <w:r>
-        <w:t xml:space="preserve">PR: </w:t>
+        <w:t xml:space="preserve">Source: </w:t>
       </w:r>
       <w:hyperlink r:id="rId14">
         <w:r>
@@ -506,278 +185,10 @@
             <w:color w:val="1155CC"/>
             <w:u w:val="single"/>
           </w:rPr>
-          <w:t>https://github.com/openai/openai-agents-python/pull/3991</w:t>
+          <w:t>https://github.com/dk3yyyy/local_AI_agent</w:t>
         </w:r>
       </w:hyperlink>
       <w:r/>
-    </w:p>
-    <w:p>
-      <w:pPr>
-        <w:spacing w:after="0"/>
-      </w:pPr>
-      <w:r>
-        <w:rPr>
-          <w:b/>
-        </w:rPr>
-        <w:t>Pydantic AI Harness | Merged PR #503</w:t>
-      </w:r>
-    </w:p>
-    <w:p>
-      <w:pPr>
-        <w:spacing w:after="0"/>
-      </w:pPr>
-      <w:r>
-        <w:rPr>
-          <w:i/>
-        </w:rPr>
-        <w:t>Python, agent recovery, Code Mode, pytest | Jul 2026</w:t>
-      </w:r>
-    </w:p>
-    <w:p>
-      <w:pPr>
-        <w:spacing w:after="0"/>
-        <w:ind w:left="288" w:hanging="173"/>
-        <w:numPr>
-          <w:ilvl w:val="0"/>
-          <w:numId w:val="10"/>
-        </w:numPr>
-      </w:pPr>
-      <w:r>
-        <w:t>Surfaced unexpected Code Mode execution failures to the model as retries after resetting invalid session state, enabling recovery from lost imports and variables.</w:t>
-      </w:r>
-    </w:p>
-    <w:p>
-      <w:pPr>
-        <w:spacing w:after="0"/>
-        <w:ind w:left="288" w:hanging="173"/>
-        <w:numPr>
-          <w:ilvl w:val="0"/>
-          <w:numId w:val="10"/>
-        </w:numPr>
-      </w:pPr>
-      <w:r>
-        <w:t xml:space="preserve">PR: </w:t>
-      </w:r>
-      <w:hyperlink r:id="rId15">
-        <w:r>
-          <w:rPr>
-            <w:color w:val="1155CC"/>
-            <w:u w:val="single"/>
-          </w:rPr>
-          <w:t>https://github.com/pydantic/pydantic-ai-harness/pull/503</w:t>
-        </w:r>
-      </w:hyperlink>
-      <w:r/>
-    </w:p>
-    <w:p>
-      <w:pPr>
-        <w:spacing w:after="0"/>
-      </w:pPr>
-      <w:r>
-        <w:rPr>
-          <w:b/>
-        </w:rPr>
-        <w:t>Mellea | Merged PR #1471</w:t>
-      </w:r>
-    </w:p>
-    <w:p>
-      <w:pPr>
-        <w:spacing w:after="0"/>
-      </w:pPr>
-      <w:r>
-        <w:rPr>
-          <w:i/>
-        </w:rPr>
-        <w:t>Python, OpenTelemetry tracing, async tests, pytest | Jul 2026</w:t>
-      </w:r>
-    </w:p>
-    <w:p>
-      <w:pPr>
-        <w:spacing w:after="0"/>
-        <w:ind w:left="288" w:hanging="173"/>
-        <w:numPr>
-          <w:ilvl w:val="0"/>
-          <w:numId w:val="10"/>
-        </w:numPr>
-      </w:pPr>
-      <w:r>
-        <w:t>Added deterministic mocked-backend tests for async span timing, context propagation, token usage, span lifetime, and consecutive generations.</w:t>
-      </w:r>
-    </w:p>
-    <w:p>
-      <w:pPr>
-        <w:spacing w:after="0"/>
-        <w:ind w:left="288" w:hanging="173"/>
-        <w:numPr>
-          <w:ilvl w:val="0"/>
-          <w:numId w:val="10"/>
-        </w:numPr>
-      </w:pPr>
-      <w:r>
-        <w:t xml:space="preserve">PR: </w:t>
-      </w:r>
-      <w:hyperlink r:id="rId16">
-        <w:r>
-          <w:rPr>
-            <w:color w:val="1155CC"/>
-            <w:u w:val="single"/>
-          </w:rPr>
-          <w:t>https://github.com/generative-computing/mellea/pull/1471</w:t>
-        </w:r>
-      </w:hyperlink>
-      <w:r/>
-    </w:p>
-    <w:p>
-      <w:pPr>
-        <w:spacing w:after="0"/>
-      </w:pPr>
-      <w:r>
-        <w:rPr>
-          <w:b/>
-        </w:rPr>
-        <w:t>FastStream | Merged PR #2961</w:t>
-      </w:r>
-    </w:p>
-    <w:p>
-      <w:pPr>
-        <w:spacing w:after="0"/>
-      </w:pPr>
-      <w:r>
-        <w:rPr>
-          <w:i/>
-        </w:rPr>
-        <w:t>Python, FastAPI compatibility, dependency injection, pytest | Jul 2026</w:t>
-      </w:r>
-    </w:p>
-    <w:p>
-      <w:pPr>
-        <w:spacing w:after="0"/>
-        <w:ind w:left="288" w:hanging="173"/>
-        <w:numPr>
-          <w:ilvl w:val="0"/>
-          <w:numId w:val="10"/>
-        </w:numPr>
-      </w:pPr>
-      <w:r>
-        <w:t>Restored FastAPI 0.140 compatibility for slotted Dependant objects while retaining native dependency fields and FastStream schema metadata.</w:t>
-      </w:r>
-    </w:p>
-    <w:p>
-      <w:pPr>
-        <w:spacing w:after="0"/>
-        <w:ind w:left="288" w:hanging="173"/>
-        <w:numPr>
-          <w:ilvl w:val="0"/>
-          <w:numId w:val="10"/>
-        </w:numPr>
-      </w:pPr>
-      <w:r>
-        <w:t xml:space="preserve">PR: </w:t>
-      </w:r>
-      <w:hyperlink r:id="rId17">
-        <w:r>
-          <w:rPr>
-            <w:color w:val="1155CC"/>
-            <w:u w:val="single"/>
-          </w:rPr>
-          <w:t>https://github.com/ag2ai/faststream/pull/2961</w:t>
-        </w:r>
-      </w:hyperlink>
-      <w:r/>
-    </w:p>
-    <w:p>
-      <w:pPr>
-        <w:spacing w:after="0"/>
-      </w:pPr>
-      <w:r>
-        <w:rPr>
-          <w:b/>
-        </w:rPr>
-        <w:t>Additional verified upstream merges | 4 of 8 merged PRs</w:t>
-      </w:r>
-    </w:p>
-    <w:p>
-      <w:pPr>
-        <w:spacing w:after="0"/>
-      </w:pPr>
-      <w:r>
-        <w:rPr>
-          <w:i/>
-        </w:rPr>
-        <w:t>Correctness, dependency errors, schema generation, workflow scoping | Jul 2026</w:t>
-      </w:r>
-    </w:p>
-    <w:p>
-      <w:pPr>
-        <w:spacing w:after="0"/>
-        <w:ind w:left="288" w:hanging="173"/>
-        <w:numPr>
-          <w:ilvl w:val="0"/>
-          <w:numId w:val="10"/>
-        </w:numPr>
-      </w:pPr>
-      <w:r>
-        <w:t xml:space="preserve">Apache Arrow Rust: </w:t>
-      </w:r>
-      <w:hyperlink r:id="rId18">
-        <w:r>
-          <w:rPr>
-            <w:color w:val="1155CC"/>
-            <w:u w:val="single"/>
-          </w:rPr>
-          <w:t>https://github.com/apache/arrow-rs/pull/10486</w:t>
-        </w:r>
-      </w:hyperlink>
-      <w:r>
-        <w:t xml:space="preserve"> | Altair: </w:t>
-      </w:r>
-      <w:hyperlink r:id="rId19">
-        <w:r>
-          <w:rPr>
-            <w:color w:val="1155CC"/>
-            <w:u w:val="single"/>
-          </w:rPr>
-          <w:t>https://github.com/vega/altair/pull/4089</w:t>
-        </w:r>
-      </w:hyperlink>
-      <w:r>
-        <w:t xml:space="preserve"> | FastStream FastAPI: </w:t>
-      </w:r>
-      <w:hyperlink r:id="rId20">
-        <w:r>
-          <w:rPr>
-            <w:color w:val="1155CC"/>
-            <w:u w:val="single"/>
-          </w:rPr>
-          <w:t>https://github.com/faststream-community/faststream_fastapi/pull/2</w:t>
-        </w:r>
-      </w:hyperlink>
-      <w:r>
-        <w:t xml:space="preserve"> | Calkit: </w:t>
-      </w:r>
-      <w:hyperlink r:id="rId21">
-        <w:r>
-          <w:rPr>
-            <w:color w:val="1155CC"/>
-            <w:u w:val="single"/>
-          </w:rPr>
-          <w:t>https://github.com/calkit/calkit/pull/1028</w:t>
-        </w:r>
-      </w:hyperlink>
-      <w:r/>
-    </w:p>
-    <w:p>
-      <w:pPr>
-        <w:pStyle w:val="Heading1"/>
-        <w:spacing w:before="120" w:after="40"/>
-      </w:pPr>
-      <w:r>
-        <w:rPr>
-          <w:b/>
-          <w:sz w:val="23"/>
-        </w:rPr>
-        <w:t>SELECTED PROJECTS</w:t>
-      </w:r>
     </w:p>
     <w:p>
       <w:pPr>
@@ -824,20 +235,7 @@
         </w:numPr>
       </w:pPr>
       <w:r>
-        <w:t>Implemented bounded context memory, transcription and provider routing, explicit data-sharing controls, and cost-aware fallbacks.</w:t>
-      </w:r>
-    </w:p>
-    <w:p>
-      <w:pPr>
-        <w:spacing w:after="0"/>
-        <w:ind w:left="288" w:hanging="173"/>
-        <w:numPr>
-          <w:ilvl w:val="0"/>
-          <w:numId w:val="10"/>
-        </w:numPr>
-      </w:pPr>
-      <w:r>
-        <w:t>Hardened Electron boundaries with sandboxing, context isolation, restricted IPC, automated tests, secret scanning, and release checks.</w:t>
+        <w:t>Implemented bounded context memory, provider routing, explicit data-sharing controls, sandboxed Electron boundaries, automated tests, secret scanning, and release checks.</w:t>
       </w:r>
     </w:p>
     <w:p>
@@ -852,7 +250,7 @@
       <w:r>
         <w:t xml:space="preserve">Source: </w:t>
       </w:r>
-      <w:hyperlink r:id="rId22">
+      <w:hyperlink r:id="rId15">
         <w:r>
           <w:rPr>
             <w:color w:val="1155CC"/>
@@ -908,7 +306,7 @@
         </w:numPr>
       </w:pPr>
       <w:r>
-        <w:t>Evaluated with rolling-origin testing across 1,140 Premier League matches: 53.77% outcome accuracy versus a 56.70% bookmaker-implied benchmark, showing signal but no practical betting advantage.</w:t>
+        <w:t>Evaluated with rolling-origin testing across 1,140 Premier League matches: 53.77% outcome accuracy versus a 56.70% bookmaker-implied benchmark; the model did not outperform the benchmark.</w:t>
       </w:r>
     </w:p>
     <w:p>
@@ -923,7 +321,7 @@
       <w:r>
         <w:t xml:space="preserve">Source: </w:t>
       </w:r>
-      <w:hyperlink r:id="rId23">
+      <w:hyperlink r:id="rId16">
         <w:r>
           <w:rPr>
             <w:color w:val="1155CC"/>
@@ -936,13 +334,26 @@
     </w:p>
     <w:p>
       <w:pPr>
+        <w:pStyle w:val="Heading1"/>
+        <w:spacing w:before="120" w:after="40"/>
+      </w:pPr>
+      <w:r>
+        <w:rPr>
+          <w:b/>
+          <w:sz w:val="23"/>
+        </w:rPr>
+        <w:t>OPEN-SOURCE CONTRIBUTIONS</w:t>
+      </w:r>
+    </w:p>
+    <w:p>
+      <w:pPr>
         <w:spacing w:after="0"/>
       </w:pPr>
       <w:r>
         <w:rPr>
           <w:b/>
         </w:rPr>
-        <w:t>Noughtline | Real-Time Multiplayer System</w:t>
+        <w:t>OpenAI Agents Python SDK | Merged PR #3991</w:t>
       </w:r>
     </w:p>
     <w:p>
@@ -953,7 +364,7 @@
         <w:rPr>
           <w:i/>
         </w:rPr>
-        <w:t>React, Express, Socket.IO, SQLite, Paystack</w:t>
+        <w:t>Python, WebSockets, retry policies, pytest | Jul 2026</w:t>
       </w:r>
     </w:p>
     <w:p>
@@ -966,7 +377,39 @@
         </w:numPr>
       </w:pPr>
       <w:r>
-        <w:t>Built signed guest sessions, server-authoritative moves, reconnect and forfeit handling, transactional match settlement, and an append-only currency ledger.</w:t>
+        <w:t xml:space="preserve">Made transient pre-response WebSocket server errors follow the SDK's retry policy while preserving non-transient handling and replay-safety checks. PR: </w:t>
+      </w:r>
+      <w:hyperlink r:id="rId17">
+        <w:r>
+          <w:rPr>
+            <w:color w:val="1155CC"/>
+            <w:u w:val="single"/>
+          </w:rPr>
+          <w:t>https://github.com/openai/openai-agents-python/pull/3991</w:t>
+        </w:r>
+      </w:hyperlink>
+      <w:r/>
+    </w:p>
+    <w:p>
+      <w:pPr>
+        <w:spacing w:after="0"/>
+      </w:pPr>
+      <w:r>
+        <w:rPr>
+          <w:b/>
+        </w:rPr>
+        <w:t>Pydantic AI Harness | Merged PR #503</w:t>
+      </w:r>
+    </w:p>
+    <w:p>
+      <w:pPr>
+        <w:spacing w:after="0"/>
+      </w:pPr>
+      <w:r>
+        <w:rPr>
+          <w:i/>
+        </w:rPr>
+        <w:t>Python, agent recovery, Code Mode, pytest | Jul 2026</w:t>
       </w:r>
     </w:p>
     <w:p>
@@ -979,7 +422,44 @@
         </w:numPr>
       </w:pPr>
       <w:r>
-        <w:t>Added idempotent Paystack crediting plus automated API, economy, room-state, and two-client Socket.IO tests.</w:t>
+        <w:t xml:space="preserve">Surfaced unexpected Code Mode execution failures to the model as retries after resetting invalid session state, enabling recovery from lost imports and variables. PR: </w:t>
+      </w:r>
+      <w:hyperlink r:id="rId18">
+        <w:r>
+          <w:rPr>
+            <w:color w:val="1155CC"/>
+            <w:u w:val="single"/>
+          </w:rPr>
+          <w:t>https://github.com/pydantic/pydantic-ai-harness/pull/503</w:t>
+        </w:r>
+      </w:hyperlink>
+      <w:r/>
+    </w:p>
+    <w:p>
+      <w:r>
+        <w:br w:type="page"/>
+      </w:r>
+    </w:p>
+    <w:p>
+      <w:pPr>
+        <w:spacing w:after="0"/>
+      </w:pPr>
+      <w:r>
+        <w:rPr>
+          <w:b/>
+        </w:rPr>
+        <w:t>Mellea | Merged PR #1471</w:t>
+      </w:r>
+    </w:p>
+    <w:p>
+      <w:pPr>
+        <w:spacing w:after="0"/>
+      </w:pPr>
+      <w:r>
+        <w:rPr>
+          <w:i/>
+        </w:rPr>
+        <w:t>Python, OpenTelemetry tracing, async tests, pytest | Jul 2026</w:t>
       </w:r>
     </w:p>
     <w:p>
@@ -992,7 +472,133 @@
         </w:numPr>
       </w:pPr>
       <w:r>
-        <w:t xml:space="preserve">Live: </w:t>
+        <w:t xml:space="preserve">Added deterministic mocked-backend tests for async span timing, context propagation, token usage, span lifetime, and consecutive generations. PR: </w:t>
+      </w:r>
+      <w:hyperlink r:id="rId19">
+        <w:r>
+          <w:rPr>
+            <w:color w:val="1155CC"/>
+            <w:u w:val="single"/>
+          </w:rPr>
+          <w:t>https://github.com/generative-computing/mellea/pull/1471</w:t>
+        </w:r>
+      </w:hyperlink>
+      <w:r/>
+    </w:p>
+    <w:p>
+      <w:pPr>
+        <w:spacing w:after="0"/>
+      </w:pPr>
+      <w:r>
+        <w:rPr>
+          <w:b/>
+        </w:rPr>
+        <w:t>FastStream | Merged PR #2961</w:t>
+      </w:r>
+    </w:p>
+    <w:p>
+      <w:pPr>
+        <w:spacing w:after="0"/>
+      </w:pPr>
+      <w:r>
+        <w:rPr>
+          <w:i/>
+        </w:rPr>
+        <w:t>Python, FastAPI compatibility, dependency injection, pytest | Jul 2026</w:t>
+      </w:r>
+    </w:p>
+    <w:p>
+      <w:pPr>
+        <w:spacing w:after="0"/>
+        <w:ind w:left="288" w:hanging="173"/>
+        <w:numPr>
+          <w:ilvl w:val="0"/>
+          <w:numId w:val="10"/>
+        </w:numPr>
+      </w:pPr>
+      <w:r>
+        <w:t xml:space="preserve">Restored FastAPI 0.140 compatibility for slotted Dependant objects while retaining native dependency fields and FastStream schema metadata. PR: </w:t>
+      </w:r>
+      <w:hyperlink r:id="rId20">
+        <w:r>
+          <w:rPr>
+            <w:color w:val="1155CC"/>
+            <w:u w:val="single"/>
+          </w:rPr>
+          <w:t>https://github.com/ag2ai/faststream/pull/2961</w:t>
+        </w:r>
+      </w:hyperlink>
+      <w:r/>
+    </w:p>
+    <w:p>
+      <w:pPr>
+        <w:spacing w:after="0"/>
+      </w:pPr>
+      <w:r>
+        <w:rPr>
+          <w:b/>
+        </w:rPr>
+        <w:t>Additional verified upstream merges | 4 of 8 merged PRs</w:t>
+      </w:r>
+    </w:p>
+    <w:p>
+      <w:pPr>
+        <w:spacing w:after="0"/>
+      </w:pPr>
+      <w:r>
+        <w:rPr>
+          <w:i/>
+        </w:rPr>
+        <w:t>Correctness, dependency errors, schema generation, workflow scoping | Jul 2026</w:t>
+      </w:r>
+    </w:p>
+    <w:p>
+      <w:pPr>
+        <w:spacing w:after="0"/>
+        <w:ind w:left="288" w:hanging="173"/>
+        <w:numPr>
+          <w:ilvl w:val="0"/>
+          <w:numId w:val="10"/>
+        </w:numPr>
+      </w:pPr>
+      <w:r>
+        <w:t xml:space="preserve">Apache Arrow Rust: </w:t>
+      </w:r>
+      <w:hyperlink r:id="rId21">
+        <w:r>
+          <w:rPr>
+            <w:color w:val="1155CC"/>
+            <w:u w:val="single"/>
+          </w:rPr>
+          <w:t>https://github.com/apache/arrow-rs/pull/10486</w:t>
+        </w:r>
+      </w:hyperlink>
+      <w:r>
+        <w:t xml:space="preserve"> | Altair: </w:t>
+      </w:r>
+      <w:hyperlink r:id="rId22">
+        <w:r>
+          <w:rPr>
+            <w:color w:val="1155CC"/>
+            <w:u w:val="single"/>
+          </w:rPr>
+          <w:t>https://github.com/vega/altair/pull/4089</w:t>
+        </w:r>
+      </w:hyperlink>
+      <w:r>
+        <w:t xml:space="preserve"> | FastStream FastAPI: </w:t>
+      </w:r>
+      <w:hyperlink r:id="rId23">
+        <w:r>
+          <w:rPr>
+            <w:color w:val="1155CC"/>
+            <w:u w:val="single"/>
+          </w:rPr>
+          <w:t>https://github.com/faststream-community/faststream_fastapi/pull/2</w:t>
+        </w:r>
+      </w:hyperlink>
+      <w:r>
+        <w:t xml:space="preserve"> | Calkit: </w:t>
       </w:r>
       <w:hyperlink r:id="rId24">
         <w:r>
@@ -1000,22 +606,286 @@
             <w:color w:val="1155CC"/>
             <w:u w:val="single"/>
           </w:rPr>
-          <w:t>https://noughtline.onrender.com</w:t>
-        </w:r>
-      </w:hyperlink>
-      <w:r>
-        <w:t xml:space="preserve"> | Source: </w:t>
-      </w:r>
-      <w:hyperlink r:id="rId25">
-        <w:r>
-          <w:rPr>
-            <w:color w:val="1155CC"/>
-            <w:u w:val="single"/>
-          </w:rPr>
-          <w:t>https://github.com/dk3yyyy/Noughtline</w:t>
+          <w:t>https://github.com/calkit/calkit/pull/1028</w:t>
         </w:r>
       </w:hyperlink>
       <w:r/>
+    </w:p>
+    <w:p>
+      <w:pPr>
+        <w:pStyle w:val="Heading1"/>
+        <w:spacing w:before="120" w:after="40"/>
+      </w:pPr>
+      <w:r>
+        <w:rPr>
+          <w:b/>
+          <w:sz w:val="23"/>
+        </w:rPr>
+        <w:t>EXPERIENCE</w:t>
+      </w:r>
+    </w:p>
+    <w:p>
+      <w:pPr>
+        <w:spacing w:after="0"/>
+      </w:pPr>
+      <w:r>
+        <w:rPr>
+          <w:b/>
+        </w:rPr>
+        <w:t>AI Engineer</w:t>
+      </w:r>
+      <w:r>
+        <w:rPr>
+          <w:i/>
+        </w:rPr>
+        <w:t xml:space="preserve"> | Nov 2025 - Present</w:t>
+      </w:r>
+    </w:p>
+    <w:p>
+      <w:pPr>
+        <w:spacing w:after="0"/>
+      </w:pPr>
+      <w:r>
+        <w:t>VolyxAI | Independent AI product development</w:t>
+      </w:r>
+    </w:p>
+    <w:p>
+      <w:pPr>
+        <w:spacing w:after="0"/>
+        <w:ind w:left="288" w:hanging="173"/>
+        <w:numPr>
+          <w:ilvl w:val="0"/>
+          <w:numId w:val="10"/>
+        </w:numPr>
+      </w:pPr>
+      <w:r>
+        <w:t>Build applied AI systems integrating retrieval, multimodal inputs, voice workflows, model APIs, and structured outputs.</w:t>
+      </w:r>
+    </w:p>
+    <w:p>
+      <w:pPr>
+        <w:spacing w:after="0"/>
+        <w:ind w:left="288" w:hanging="173"/>
+        <w:numPr>
+          <w:ilvl w:val="0"/>
+          <w:numId w:val="10"/>
+        </w:numPr>
+      </w:pPr>
+      <w:r>
+        <w:t>Develop Python services and n8n workflows with webhooks, validation, retries, logging, human approval, and provider fallback.</w:t>
+      </w:r>
+    </w:p>
+    <w:p>
+      <w:pPr>
+        <w:spacing w:after="40"/>
+      </w:pPr>
+      <w:r>
+        <w:rPr>
+          <w:b/>
+        </w:rPr>
+        <w:t xml:space="preserve">Key tools: </w:t>
+      </w:r>
+      <w:r>
+        <w:t>Python, FastAPI, n8n, REST APIs, webhooks, Azure AI Foundry, OpenAI-compatible APIs, PostgreSQL, Redis</w:t>
+      </w:r>
+    </w:p>
+    <w:p>
+      <w:pPr>
+        <w:spacing w:after="0"/>
+      </w:pPr>
+      <w:r>
+        <w:rPr>
+          <w:b/>
+        </w:rPr>
+        <w:t>Python Automation Developer</w:t>
+      </w:r>
+      <w:r>
+        <w:rPr>
+          <w:i/>
+        </w:rPr>
+        <w:t xml:space="preserve"> | Jan 2023 - Present</w:t>
+      </w:r>
+    </w:p>
+    <w:p>
+      <w:pPr>
+        <w:spacing w:after="0"/>
+      </w:pPr>
+      <w:r>
+        <w:t>Freelance | Independent paid client work</w:t>
+      </w:r>
+    </w:p>
+    <w:p>
+      <w:pPr>
+        <w:spacing w:after="0"/>
+        <w:ind w:left="288" w:hanging="173"/>
+        <w:numPr>
+          <w:ilvl w:val="0"/>
+          <w:numId w:val="10"/>
+        </w:numPr>
+      </w:pPr>
+      <w:r>
+        <w:t>Developed streaming utilities for large text datasets, including domain filtering, deduplication, splitting, and list curation.</w:t>
+      </w:r>
+    </w:p>
+    <w:p>
+      <w:pPr>
+        <w:spacing w:after="0"/>
+        <w:ind w:left="288" w:hanging="173"/>
+        <w:numPr>
+          <w:ilvl w:val="0"/>
+          <w:numId w:val="10"/>
+        </w:numPr>
+      </w:pPr>
+      <w:r>
+        <w:t>Built Telegram integrations and asynchronous services using PostgreSQL, Redis, and Docker; integrated external APIs with explicit error handling, rate limits, and operational logging.</w:t>
+      </w:r>
+    </w:p>
+    <w:p>
+      <w:pPr>
+        <w:spacing w:after="0"/>
+        <w:ind w:left="288" w:hanging="173"/>
+        <w:numPr>
+          <w:ilvl w:val="0"/>
+          <w:numId w:val="10"/>
+        </w:numPr>
+      </w:pPr>
+      <w:r>
+        <w:t>Developed licensing and key-management components for proprietary Python tools, and published reusable command-line utilities for splitting and sorting large text datasets.</w:t>
+      </w:r>
+    </w:p>
+    <w:p>
+      <w:pPr>
+        <w:spacing w:after="40"/>
+      </w:pPr>
+      <w:r>
+        <w:rPr>
+          <w:b/>
+        </w:rPr>
+        <w:t xml:space="preserve">Key tools: </w:t>
+      </w:r>
+      <w:r>
+        <w:t>Python, scripting, asyncio, Telegram Bot API, aiohttp, PostgreSQL, Redis, Docker, REST APIs</w:t>
+      </w:r>
+    </w:p>
+    <w:p>
+      <w:pPr>
+        <w:pStyle w:val="Heading1"/>
+        <w:spacing w:before="120" w:after="40"/>
+      </w:pPr>
+      <w:r>
+        <w:rPr>
+          <w:b/>
+          <w:sz w:val="23"/>
+        </w:rPr>
+        <w:t>CORE SKILLS</w:t>
+      </w:r>
+    </w:p>
+    <w:p>
+      <w:pPr>
+        <w:spacing w:after="0"/>
+        <w:ind w:left="288" w:hanging="173"/>
+        <w:numPr>
+          <w:ilvl w:val="0"/>
+          <w:numId w:val="10"/>
+        </w:numPr>
+      </w:pPr>
+      <w:r>
+        <w:t>Languages: Python, SQL</w:t>
+      </w:r>
+    </w:p>
+    <w:p>
+      <w:pPr>
+        <w:spacing w:after="0"/>
+        <w:ind w:left="288" w:hanging="173"/>
+        <w:numPr>
+          <w:ilvl w:val="0"/>
+          <w:numId w:val="10"/>
+        </w:numPr>
+      </w:pPr>
+      <w:r>
+        <w:t>AI Engineering: retrieval, multimodal inference, voice AI, structured outputs, provider routing, model evaluation</w:t>
+      </w:r>
+    </w:p>
+    <w:p>
+      <w:pPr>
+        <w:spacing w:after="0"/>
+        <w:ind w:left="288" w:hanging="173"/>
+        <w:numPr>
+          <w:ilvl w:val="0"/>
+          <w:numId w:val="10"/>
+        </w:numPr>
+      </w:pPr>
+      <w:r>
+        <w:t>Models &amp; Providers: Azure AI Foundry, OpenAI-compatible APIs, Deepgram</w:t>
+      </w:r>
+    </w:p>
+    <w:p>
+      <w:pPr>
+        <w:spacing w:after="0"/>
+        <w:ind w:left="288" w:hanging="173"/>
+        <w:numPr>
+          <w:ilvl w:val="0"/>
+          <w:numId w:val="10"/>
+        </w:numPr>
+      </w:pPr>
+      <w:r>
+        <w:t>ML &amp; Data: scikit-learn, XGBoost, pandas, feature engineering, temporal evaluation</w:t>
+      </w:r>
+    </w:p>
+    <w:p>
+      <w:pPr>
+        <w:spacing w:after="0"/>
+        <w:ind w:left="288" w:hanging="173"/>
+        <w:numPr>
+          <w:ilvl w:val="0"/>
+          <w:numId w:val="10"/>
+        </w:numPr>
+      </w:pPr>
+      <w:r>
+        <w:t>Backend &amp; Automation: FastAPI, asyncio, REST APIs, n8n, webhooks, SQLAlchemy</w:t>
+      </w:r>
+    </w:p>
+    <w:p>
+      <w:pPr>
+        <w:spacing w:after="0"/>
+        <w:ind w:left="288" w:hanging="173"/>
+        <w:numPr>
+          <w:ilvl w:val="0"/>
+          <w:numId w:val="10"/>
+        </w:numPr>
+      </w:pPr>
+      <w:r>
+        <w:t>Data &amp; Infrastructure: PostgreSQL, SQLite, Redis, Docker, GitHub Actions, Linux</w:t>
+      </w:r>
+    </w:p>
+    <w:p>
+      <w:pPr>
+        <w:pStyle w:val="Heading1"/>
+        <w:spacing w:before="120" w:after="40"/>
+      </w:pPr>
+      <w:r>
+        <w:rPr>
+          <w:b/>
+          <w:sz w:val="23"/>
+        </w:rPr>
+        <w:t>EDUCATION</w:t>
+      </w:r>
+    </w:p>
+    <w:p>
+      <w:pPr>
+        <w:spacing w:after="0"/>
+      </w:pPr>
+      <w:r>
+        <w:t>MSc Artificial Intelligence · Northumbria University · September 2026 intake</w:t>
+      </w:r>
+    </w:p>
+    <w:p>
+      <w:pPr>
+        <w:spacing w:after="0"/>
+      </w:pPr>
+      <w:r>
+        <w:t>Bachelor of Technology (BTech), Mathematics · Federal University of Technology, Owerri (FUTO) · 2016–2021</w:t>
+      </w:r>
     </w:p>
     <w:p>
       <w:pPr>
@@ -1042,7 +912,7 @@
       <w:r>
         <w:t xml:space="preserve">Scientific Computing with Python Developer Certification | freeCodeCamp | May 2026 | </w:t>
       </w:r>
-      <w:hyperlink r:id="rId26">
+      <w:hyperlink r:id="rId25">
         <w:r>
           <w:rPr>
             <w:color w:val="1155CC"/>
@@ -1062,9 +932,9 @@
         </w:numPr>
       </w:pPr>
       <w:r>
-        <w:t xml:space="preserve">Google AI Specialization | Google/Coursera | February 2026 | </w:t>
+        <w:t xml:space="preserve">Google AI Professional Certificate | Google/Coursera | February 2026 | </w:t>
       </w:r>
-      <w:hyperlink r:id="rId27">
+      <w:hyperlink r:id="rId26">
         <w:r>
           <w:rPr>
             <w:color w:val="1155CC"/>
@@ -1086,7 +956,7 @@
       <w:r>
         <w:t xml:space="preserve">Model Context Protocol: Advanced Topics | Anthropic training | March 2026 | </w:t>
       </w:r>
-      <w:hyperlink r:id="rId28">
+      <w:hyperlink r:id="rId27">
         <w:r>
           <w:rPr>
             <w:color w:val="1155CC"/>
@@ -1095,35 +965,6 @@
           <w:t>Verify credential</w:t>
         </w:r>
       </w:hyperlink>
-    </w:p>
-    <w:p>
-      <w:pPr>
-        <w:pStyle w:val="Heading1"/>
-        <w:spacing w:before="120" w:after="40"/>
-      </w:pPr>
-      <w:r>
-        <w:rPr>
-          <w:b/>
-          <w:sz w:val="23"/>
-        </w:rPr>
-        <w:t>EDUCATION</w:t>
-      </w:r>
-    </w:p>
-    <w:p>
-      <w:pPr>
-        <w:spacing w:after="0"/>
-      </w:pPr>
-      <w:r>
-        <w:t>Bachelor of Technology (BTech), Mathematics · Federal University of Technology, Owerri (FUTO) · 2016–2021</w:t>
-      </w:r>
-    </w:p>
-    <w:p>
-      <w:pPr>
-        <w:spacing w:after="0"/>
-      </w:pPr>
-      <w:r>
-        <w:t>MSc Artificial Intelligence · Northumbria University · September 2026 intake</w:t>
-      </w:r>
     </w:p>
     <w:sectPr>
       <w:headerReference w:type="default" r:id="rId9"/>
@@ -1528,7 +1369,7 @@
     <w:rsid w:val="00FC693F"/>
     <w:rPr>
       <w:rFonts w:ascii="Arial" w:hAnsi="Arial" w:eastAsia="Arial"/>
-      <w:sz w:val="20"/>
+      <w:sz w:val="21"/>
     </w:rPr>
   </w:style>
   <w:style w:type="paragraph" w:styleId="Header">

</xml_diff>